<commit_message>
Remove all comments in the manuscript files
</commit_message>
<xml_diff>
--- a/protocol-publication/advance-trauma-protocol-paper-revision-1-marked-up-copy.docx
+++ b/protocol-publication/advance-trauma-protocol-paper-revision-1-marked-up-copy.docx
@@ -677,31 +677,10 @@
         <w:rPr>
           <w:highlight w:val="yellow"/>
         </w:rPr>
-        <w:t xml:space="preserve"> </w:t>
-      </w:r>
-      <w:r>
-        <w:rPr>
-          <w:highlight w:val="yellow"/>
-        </w:rPr>
-        <w:t xml:space="preserve">The primary outcome </w:t>
-      </w:r>
-      <w:r>
-        <w:rPr>
-          <w:highlight w:val="yellow"/>
-        </w:rPr>
-        <w:t>is</w:t>
-      </w:r>
-      <w:r>
-        <w:rPr>
-          <w:highlight w:val="yellow"/>
-        </w:rPr>
-        <w:t xml:space="preserve"> in-hospital mortality within 30 days of arrival at the emergency department.</w:t>
-      </w:r>
-      <w:r>
-        <w:t xml:space="preserve"> </w:t>
-      </w:r>
-      <w:r>
-        <w:t xml:space="preserve"> </w:t>
+        <w:t xml:space="preserve"> The primary outcome is in-hospital mortality within 30 days of arrival at the emergency department.</w:t>
+      </w:r>
+      <w:r>
+        <w:t xml:space="preserve">  </w:t>
       </w:r>
     </w:p>
     <w:p>
@@ -912,21 +891,7 @@
           </w:tcPr>
           <w:p>
             <w:r>
-              <w:t>Clinical Trials Registry – India (</w:t>
-            </w:r>
-            <w:commentRangeStart w:id="0"/>
-            <w:r>
-              <w:t>CTRI/2024/07/071336</w:t>
-            </w:r>
-            <w:commentRangeEnd w:id="0"/>
-            <w:r>
-              <w:rPr>
-                <w:rStyle w:val="CommentReference"/>
-              </w:rPr>
-              <w:commentReference w:id="0"/>
-            </w:r>
-            <w:r>
-              <w:t>), ClinicalTrials.gov (NCT06321419</w:t>
+              <w:t>Clinical Trials Registry – India (CTRI/2024/07/071336), ClinicalTrials.gov (NCT06321419</w:t>
             </w:r>
             <w:r>
               <w:t xml:space="preserve">, </w:t>
@@ -2210,7 +2175,7 @@
           <w:noProof/>
         </w:rPr>
         <w:drawing>
-          <wp:inline distT="0" distB="0" distL="0" distR="0" wp14:anchorId="4B665B8A" wp14:editId="07D3E02B">
+          <wp:inline distT="0" distB="0" distL="0" distR="0" wp14:anchorId="4B665B8A" wp14:editId="70E7DD12">
             <wp:extent cx="5376333" cy="3225800"/>
             <wp:effectExtent l="0" t="0" r="0" b="0"/>
             <wp:docPr id="641952518" name="Picture 2"/>
@@ -2225,7 +2190,7 @@
                     <pic:cNvPicPr/>
                   </pic:nvPicPr>
                   <pic:blipFill>
-                    <a:blip r:embed="rId11" cstate="print">
+                    <a:blip r:embed="rId7" cstate="print">
                       <a:extLst>
                         <a:ext uri="{28A0092B-C50C-407E-A947-70E740481C1C}">
                           <a14:useLocalDpi xmlns:a14="http://schemas.microsoft.com/office/drawing/2010/main" val="0"/>
@@ -2269,7 +2234,7 @@
           <w:noProof/>
         </w:rPr>
         <w:drawing>
-          <wp:inline distT="0" distB="0" distL="0" distR="0" wp14:anchorId="19C2E276" wp14:editId="0326F00D">
+          <wp:inline distT="0" distB="0" distL="0" distR="0" wp14:anchorId="19C2E276" wp14:editId="4D3121BB">
             <wp:extent cx="5376333" cy="3225800"/>
             <wp:effectExtent l="0" t="0" r="0" b="0"/>
             <wp:docPr id="1359493987" name="Picture 3"/>
@@ -2284,7 +2249,7 @@
                     <pic:cNvPicPr/>
                   </pic:nvPicPr>
                   <pic:blipFill>
-                    <a:blip r:embed="rId12" cstate="print">
+                    <a:blip r:embed="rId8" cstate="print">
                       <a:extLst>
                         <a:ext uri="{28A0092B-C50C-407E-A947-70E740481C1C}">
                           <a14:useLocalDpi xmlns:a14="http://schemas.microsoft.com/office/drawing/2010/main" val="0"/>
@@ -2927,16 +2892,7 @@
         <w:t xml:space="preserve"> We will not enforce adherence to ATLS</w:t>
       </w:r>
       <w:r>
-        <w:t>®</w:t>
-      </w:r>
-      <w:r>
-        <w:t>, as this study is of real-world effectiveness of ATLS</w:t>
-      </w:r>
-      <w:r>
-        <w:t>®</w:t>
-      </w:r>
-      <w:r>
-        <w:t xml:space="preserve"> rather than efficacy.</w:t>
+        <w:t>®, as this study is of real-world effectiveness of ATLS® rather than efficacy.</w:t>
       </w:r>
     </w:p>
     <w:p>
@@ -5415,7 +5371,7 @@
                     <pic:cNvPicPr preferRelativeResize="0"/>
                   </pic:nvPicPr>
                   <pic:blipFill>
-                    <a:blip r:embed="rId13"/>
+                    <a:blip r:embed="rId9"/>
                     <a:srcRect/>
                     <a:stretch>
                       <a:fillRect/>
@@ -5633,10 +5589,7 @@
         <w:t xml:space="preserve">dherence to ATLS® principles, quality of life, and disability </w:t>
       </w:r>
       <w:r>
-        <w:t xml:space="preserve">under the nested staircase design will </w:t>
-      </w:r>
-      <w:r>
-        <w:t>constitute</w:t>
+        <w:t>under the nested staircase design will constitute</w:t>
       </w:r>
       <w:r>
         <w:t xml:space="preserve"> a random subset of patients included during the staircase months. The random subset will be selected using simple random sampling </w:t>
@@ -6644,7 +6597,7 @@
                     <pic:cNvPicPr/>
                   </pic:nvPicPr>
                   <pic:blipFill>
-                    <a:blip r:embed="rId14">
+                    <a:blip r:embed="rId10">
                       <a:extLst>
                         <a:ext uri="{28A0092B-C50C-407E-A947-70E740481C1C}">
                           <a14:useLocalDpi xmlns:a14="http://schemas.microsoft.com/office/drawing/2010/main" val="0"/>
@@ -7544,97 +7497,7 @@
           <w:lang w:val="en-GB"/>
         </w:rPr>
         <w:tab/>
-        <w:t xml:space="preserve">Rauf R, von Matthey F, </w:t>
-      </w:r>
-      <w:proofErr w:type="spellStart"/>
-      <w:r>
-        <w:rPr>
-          <w:rFonts w:eastAsia="Arial Unicode MS"/>
-          <w:bdr w:val="nil"/>
-          <w:lang w:val="en-GB"/>
-        </w:rPr>
-        <w:t>Croenlein</w:t>
-      </w:r>
-      <w:proofErr w:type="spellEnd"/>
-      <w:r>
-        <w:rPr>
-          <w:rFonts w:eastAsia="Arial Unicode MS"/>
-          <w:bdr w:val="nil"/>
-          <w:lang w:val="en-GB"/>
-        </w:rPr>
-        <w:t xml:space="preserve"> M, Zyskowski M, van </w:t>
-      </w:r>
-      <w:proofErr w:type="spellStart"/>
-      <w:r>
-        <w:rPr>
-          <w:rFonts w:eastAsia="Arial Unicode MS"/>
-          <w:bdr w:val="nil"/>
-          <w:lang w:val="en-GB"/>
-        </w:rPr>
-        <w:t>Griensven</w:t>
-      </w:r>
-      <w:proofErr w:type="spellEnd"/>
-      <w:r>
-        <w:rPr>
-          <w:rFonts w:eastAsia="Arial Unicode MS"/>
-          <w:bdr w:val="nil"/>
-          <w:lang w:val="en-GB"/>
-        </w:rPr>
-        <w:t xml:space="preserve"> M, </w:t>
-      </w:r>
-      <w:proofErr w:type="spellStart"/>
-      <w:r>
-        <w:rPr>
-          <w:rFonts w:eastAsia="Arial Unicode MS"/>
-          <w:bdr w:val="nil"/>
-          <w:lang w:val="en-GB"/>
-        </w:rPr>
-        <w:t>Biberthaler</w:t>
-      </w:r>
-      <w:proofErr w:type="spellEnd"/>
-      <w:r>
-        <w:rPr>
-          <w:rFonts w:eastAsia="Arial Unicode MS"/>
-          <w:bdr w:val="nil"/>
-          <w:lang w:val="en-GB"/>
-        </w:rPr>
-        <w:t xml:space="preserve"> P, et al. Changes in the temporal distribution of in-hospital mortality in severely injured patients—An analysis of the </w:t>
-      </w:r>
-      <w:proofErr w:type="spellStart"/>
-      <w:r>
-        <w:rPr>
-          <w:rFonts w:eastAsia="Arial Unicode MS"/>
-          <w:bdr w:val="nil"/>
-          <w:lang w:val="en-GB"/>
-        </w:rPr>
-        <w:t>TraumaRegister</w:t>
-      </w:r>
-      <w:proofErr w:type="spellEnd"/>
-      <w:r>
-        <w:rPr>
-          <w:rFonts w:eastAsia="Arial Unicode MS"/>
-          <w:bdr w:val="nil"/>
-          <w:lang w:val="en-GB"/>
-        </w:rPr>
-        <w:t xml:space="preserve"> DGU. Patman S, editor. PLOS ONE. 2019 Feb;14(2</w:t>
-      </w:r>
-      <w:proofErr w:type="gramStart"/>
-      <w:r>
-        <w:rPr>
-          <w:rFonts w:eastAsia="Arial Unicode MS"/>
-          <w:bdr w:val="nil"/>
-          <w:lang w:val="en-GB"/>
-        </w:rPr>
-        <w:t>):e</w:t>
-      </w:r>
-      <w:proofErr w:type="gramEnd"/>
-      <w:r>
-        <w:rPr>
-          <w:rFonts w:eastAsia="Arial Unicode MS"/>
-          <w:bdr w:val="nil"/>
-          <w:lang w:val="en-GB"/>
-        </w:rPr>
-        <w:t xml:space="preserve">0212095. </w:t>
+        <w:t xml:space="preserve">Rauf R, von Matthey F, Croenlein M, Zyskowski M, van Griensven M, Biberthaler P, et al. Changes in the temporal distribution of in-hospital mortality in severely injured patients—An analysis of the TraumaRegister DGU. Patman S, editor. PLOS ONE. 2019 Feb;14(2):e0212095. </w:t>
       </w:r>
     </w:p>
     <w:p>
@@ -7662,61 +7525,7 @@
           <w:lang w:val="en-GB"/>
         </w:rPr>
         <w:tab/>
-        <w:t xml:space="preserve">Roy N, </w:t>
-      </w:r>
-      <w:proofErr w:type="spellStart"/>
-      <w:r>
-        <w:rPr>
-          <w:rFonts w:eastAsia="Arial Unicode MS"/>
-          <w:bdr w:val="nil"/>
-          <w:lang w:val="en-GB"/>
-        </w:rPr>
-        <w:t>Kizhakke</w:t>
-      </w:r>
-      <w:proofErr w:type="spellEnd"/>
-      <w:r>
-        <w:rPr>
-          <w:rFonts w:eastAsia="Arial Unicode MS"/>
-          <w:bdr w:val="nil"/>
-          <w:lang w:val="en-GB"/>
-        </w:rPr>
-        <w:t xml:space="preserve"> </w:t>
-      </w:r>
-      <w:proofErr w:type="spellStart"/>
-      <w:r>
-        <w:rPr>
-          <w:rFonts w:eastAsia="Arial Unicode MS"/>
-          <w:bdr w:val="nil"/>
-          <w:lang w:val="en-GB"/>
-        </w:rPr>
-        <w:t>Veetil</w:t>
-      </w:r>
-      <w:proofErr w:type="spellEnd"/>
-      <w:r>
-        <w:rPr>
-          <w:rFonts w:eastAsia="Arial Unicode MS"/>
-          <w:bdr w:val="nil"/>
-          <w:lang w:val="en-GB"/>
-        </w:rPr>
-        <w:t xml:space="preserve"> D, </w:t>
-      </w:r>
-      <w:proofErr w:type="spellStart"/>
-      <w:r>
-        <w:rPr>
-          <w:rFonts w:eastAsia="Arial Unicode MS"/>
-          <w:bdr w:val="nil"/>
-          <w:lang w:val="en-GB"/>
-        </w:rPr>
-        <w:t>Khajanchi</w:t>
-      </w:r>
-      <w:proofErr w:type="spellEnd"/>
-      <w:r>
-        <w:rPr>
-          <w:rFonts w:eastAsia="Arial Unicode MS"/>
-          <w:bdr w:val="nil"/>
-          <w:lang w:val="en-GB"/>
-        </w:rPr>
-        <w:t xml:space="preserve"> MU, Kumar V, Solomon H, Kamble J, et al. Learning from 2523 trauma deaths in India- opportunities to prevent in-hospital deaths. BMC Health Services Research [Internet]. 2017 Feb;17(1). Available from: http://dx.doi.org/10.1186/s12913-017-2085-7</w:t>
+        <w:t>Roy N, Kizhakke Veetil D, Khajanchi MU, Kumar V, Solomon H, Kamble J, et al. Learning from 2523 trauma deaths in India- opportunities to prevent in-hospital deaths. BMC Health Services Research [Internet]. 2017 Feb;17(1). Available from: http://dx.doi.org/10.1186/s12913-017-2085-7</w:t>
       </w:r>
     </w:p>
     <w:p>
@@ -7743,78 +7552,7 @@
           <w:lang w:val="en-GB"/>
         </w:rPr>
         <w:tab/>
-      </w:r>
-      <w:proofErr w:type="spellStart"/>
-      <w:r>
-        <w:rPr>
-          <w:rFonts w:eastAsia="Arial Unicode MS"/>
-          <w:bdr w:val="nil"/>
-          <w:lang w:val="en-GB"/>
-        </w:rPr>
-        <w:t>Callcut</w:t>
-      </w:r>
-      <w:proofErr w:type="spellEnd"/>
-      <w:r>
-        <w:rPr>
-          <w:rFonts w:eastAsia="Arial Unicode MS"/>
-          <w:bdr w:val="nil"/>
-          <w:lang w:val="en-GB"/>
-        </w:rPr>
-        <w:t xml:space="preserve"> RA, </w:t>
-      </w:r>
-      <w:proofErr w:type="spellStart"/>
-      <w:r>
-        <w:rPr>
-          <w:rFonts w:eastAsia="Arial Unicode MS"/>
-          <w:bdr w:val="nil"/>
-          <w:lang w:val="en-GB"/>
-        </w:rPr>
-        <w:t>Kornblith</w:t>
-      </w:r>
-      <w:proofErr w:type="spellEnd"/>
-      <w:r>
-        <w:rPr>
-          <w:rFonts w:eastAsia="Arial Unicode MS"/>
-          <w:bdr w:val="nil"/>
-          <w:lang w:val="en-GB"/>
-        </w:rPr>
-        <w:t xml:space="preserve"> LZ, Conroy AS, Robles AJ, </w:t>
-      </w:r>
-      <w:proofErr w:type="spellStart"/>
-      <w:r>
-        <w:rPr>
-          <w:rFonts w:eastAsia="Arial Unicode MS"/>
-          <w:bdr w:val="nil"/>
-          <w:lang w:val="en-GB"/>
-        </w:rPr>
-        <w:t>Meizoso</w:t>
-      </w:r>
-      <w:proofErr w:type="spellEnd"/>
-      <w:r>
-        <w:rPr>
-          <w:rFonts w:eastAsia="Arial Unicode MS"/>
-          <w:bdr w:val="nil"/>
-          <w:lang w:val="en-GB"/>
-        </w:rPr>
-        <w:t xml:space="preserve"> JP, Namias N, et al. The why and how our trauma patients die: A prospective </w:t>
-      </w:r>
-      <w:proofErr w:type="spellStart"/>
-      <w:r>
-        <w:rPr>
-          <w:rFonts w:eastAsia="Arial Unicode MS"/>
-          <w:bdr w:val="nil"/>
-          <w:lang w:val="en-GB"/>
-        </w:rPr>
-        <w:t>Multicenter</w:t>
-      </w:r>
-      <w:proofErr w:type="spellEnd"/>
-      <w:r>
-        <w:rPr>
-          <w:rFonts w:eastAsia="Arial Unicode MS"/>
-          <w:bdr w:val="nil"/>
-          <w:lang w:val="en-GB"/>
-        </w:rPr>
-        <w:t xml:space="preserve"> Western Trauma Association study. J Trauma Acute Care Surg. 2019 May;86(5):864–70. </w:t>
+        <w:t xml:space="preserve">Callcut RA, Kornblith LZ, Conroy AS, Robles AJ, Meizoso JP, Namias N, et al. The why and how our trauma patients die: A prospective Multicenter Western Trauma Association study. J Trauma Acute Care Surg. 2019 May;86(5):864–70. </w:t>
       </w:r>
     </w:p>
     <w:p>
@@ -7841,61 +7579,7 @@
           <w:lang w:val="en-GB"/>
         </w:rPr>
         <w:tab/>
-        <w:t xml:space="preserve">Ghorbani P, </w:t>
-      </w:r>
-      <w:proofErr w:type="spellStart"/>
-      <w:r>
-        <w:rPr>
-          <w:rFonts w:eastAsia="Arial Unicode MS"/>
-          <w:bdr w:val="nil"/>
-          <w:lang w:val="en-GB"/>
-        </w:rPr>
-        <w:t>Strömmer</w:t>
-      </w:r>
-      <w:proofErr w:type="spellEnd"/>
-      <w:r>
-        <w:rPr>
-          <w:rFonts w:eastAsia="Arial Unicode MS"/>
-          <w:bdr w:val="nil"/>
-          <w:lang w:val="en-GB"/>
-        </w:rPr>
-        <w:t xml:space="preserve"> L. Analysis of preventable deaths and errors in trauma care in a Scandinavian trauma </w:t>
-      </w:r>
-      <w:proofErr w:type="gramStart"/>
-      <w:r>
-        <w:rPr>
-          <w:rFonts w:eastAsia="Arial Unicode MS"/>
-          <w:bdr w:val="nil"/>
-          <w:lang w:val="en-GB"/>
-        </w:rPr>
-        <w:t>level-I</w:t>
-      </w:r>
-      <w:proofErr w:type="gramEnd"/>
-      <w:r>
-        <w:rPr>
-          <w:rFonts w:eastAsia="Arial Unicode MS"/>
-          <w:bdr w:val="nil"/>
-          <w:lang w:val="en-GB"/>
-        </w:rPr>
-        <w:t xml:space="preserve"> centre. Acta </w:t>
-      </w:r>
-      <w:proofErr w:type="spellStart"/>
-      <w:r>
-        <w:rPr>
-          <w:rFonts w:eastAsia="Arial Unicode MS"/>
-          <w:bdr w:val="nil"/>
-          <w:lang w:val="en-GB"/>
-        </w:rPr>
-        <w:t>Anaesthesiologica</w:t>
-      </w:r>
-      <w:proofErr w:type="spellEnd"/>
-      <w:r>
-        <w:rPr>
-          <w:rFonts w:eastAsia="Arial Unicode MS"/>
-          <w:bdr w:val="nil"/>
-          <w:lang w:val="en-GB"/>
-        </w:rPr>
-        <w:t xml:space="preserve"> Scandinavica. 2018 May;62(8):1146–53. </w:t>
+        <w:t xml:space="preserve">Ghorbani P, Strömmer L. Analysis of preventable deaths and errors in trauma care in a Scandinavian trauma level-I centre. Acta Anaesthesiologica Scandinavica. 2018 May;62(8):1146–53. </w:t>
       </w:r>
     </w:p>
     <w:p>
@@ -7922,25 +7606,7 @@
           <w:lang w:val="en-GB"/>
         </w:rPr>
         <w:tab/>
-        <w:t xml:space="preserve">Mohammad A, </w:t>
-      </w:r>
-      <w:proofErr w:type="spellStart"/>
-      <w:r>
-        <w:rPr>
-          <w:rFonts w:eastAsia="Arial Unicode MS"/>
-          <w:bdr w:val="nil"/>
-          <w:lang w:val="en-GB"/>
-        </w:rPr>
-        <w:t>Branicki</w:t>
-      </w:r>
-      <w:proofErr w:type="spellEnd"/>
-      <w:r>
-        <w:rPr>
-          <w:rFonts w:eastAsia="Arial Unicode MS"/>
-          <w:bdr w:val="nil"/>
-          <w:lang w:val="en-GB"/>
-        </w:rPr>
-        <w:t xml:space="preserve"> F, Abu-Zidan FM. Educational and Clinical Impact of Advanced Trauma Life Support (ATLS) Courses: A Systematic Review. World Journal of Surgery. 2013 Oct;38(2):322–9. </w:t>
+        <w:t xml:space="preserve">Mohammad A, Branicki F, Abu-Zidan FM. Educational and Clinical Impact of Advanced Trauma Life Support (ATLS) Courses: A Systematic Review. World Journal of Surgery. 2013 Oct;38(2):322–9. </w:t>
       </w:r>
     </w:p>
     <w:p>
@@ -8021,43 +7687,7 @@
           <w:lang w:val="en-GB"/>
         </w:rPr>
         <w:tab/>
-        <w:t xml:space="preserve">Jin J, </w:t>
-      </w:r>
-      <w:proofErr w:type="spellStart"/>
-      <w:r>
-        <w:rPr>
-          <w:rFonts w:eastAsia="Arial Unicode MS"/>
-          <w:bdr w:val="nil"/>
-          <w:lang w:val="en-GB"/>
-        </w:rPr>
-        <w:t>Akau’ola</w:t>
-      </w:r>
-      <w:proofErr w:type="spellEnd"/>
-      <w:r>
-        <w:rPr>
-          <w:rFonts w:eastAsia="Arial Unicode MS"/>
-          <w:bdr w:val="nil"/>
-          <w:lang w:val="en-GB"/>
-        </w:rPr>
-        <w:t xml:space="preserve"> S, Yip CH, </w:t>
-      </w:r>
-      <w:proofErr w:type="spellStart"/>
-      <w:r>
-        <w:rPr>
-          <w:rFonts w:eastAsia="Arial Unicode MS"/>
-          <w:bdr w:val="nil"/>
-          <w:lang w:val="en-GB"/>
-        </w:rPr>
-        <w:t>Nthumba</w:t>
-      </w:r>
-      <w:proofErr w:type="spellEnd"/>
-      <w:r>
-        <w:rPr>
-          <w:rFonts w:eastAsia="Arial Unicode MS"/>
-          <w:bdr w:val="nil"/>
-          <w:lang w:val="en-GB"/>
-        </w:rPr>
-        <w:t xml:space="preserve"> P, Ameh EA, de Jonge S, et al. Effectiveness of Quality Improvement Processes, Interventions, and Structure in Trauma Systems in Low- and Middle-Income Countries: A Systematic Review and Meta-analysis. World Journal of Surgery. 2021 Apr;45(7):1982–98. </w:t>
+        <w:t xml:space="preserve">Jin J, Akau’ola S, Yip CH, Nthumba P, Ameh EA, de Jonge S, et al. Effectiveness of Quality Improvement Processes, Interventions, and Structure in Trauma Systems in Low- and Middle-Income Countries: A Systematic Review and Meta-analysis. World Journal of Surgery. 2021 Apr;45(7):1982–98. </w:t>
       </w:r>
     </w:p>
     <w:p>
@@ -8111,25 +7741,7 @@
           <w:lang w:val="en-GB"/>
         </w:rPr>
         <w:tab/>
-        <w:t xml:space="preserve">American College of Surgeons C on T. Advanced Trauma Life Support® Student Course Manual. 10th </w:t>
-      </w:r>
-      <w:proofErr w:type="spellStart"/>
-      <w:r>
-        <w:rPr>
-          <w:rFonts w:eastAsia="Arial Unicode MS"/>
-          <w:bdr w:val="nil"/>
-          <w:lang w:val="en-GB"/>
-        </w:rPr>
-        <w:t>edn</w:t>
-      </w:r>
-      <w:proofErr w:type="spellEnd"/>
-      <w:r>
-        <w:rPr>
-          <w:rFonts w:eastAsia="Arial Unicode MS"/>
-          <w:bdr w:val="nil"/>
-          <w:lang w:val="en-GB"/>
-        </w:rPr>
-        <w:t xml:space="preserve">. 633 N. Saint Clair Street, Chicago, IL 60611-3211: American College of Surgeons; 2018. </w:t>
+        <w:t xml:space="preserve">American College of Surgeons C on T. Advanced Trauma Life Support® Student Course Manual. 10th edn. 633 N. Saint Clair Street, Chicago, IL 60611-3211: American College of Surgeons; 2018. </w:t>
       </w:r>
     </w:p>
     <w:p>
@@ -8210,25 +7822,7 @@
           <w:lang w:val="en-GB"/>
         </w:rPr>
         <w:tab/>
-        <w:t xml:space="preserve">Ali J, Cohen R, Adam R, Theophilus J. G, Pierre I, </w:t>
-      </w:r>
-      <w:proofErr w:type="spellStart"/>
-      <w:r>
-        <w:rPr>
-          <w:rFonts w:eastAsia="Arial Unicode MS"/>
-          <w:bdr w:val="nil"/>
-          <w:lang w:val="en-GB"/>
-        </w:rPr>
-        <w:t>Bedaysie</w:t>
-      </w:r>
-      <w:proofErr w:type="spellEnd"/>
-      <w:r>
-        <w:rPr>
-          <w:rFonts w:eastAsia="Arial Unicode MS"/>
-          <w:bdr w:val="nil"/>
-          <w:lang w:val="en-GB"/>
-        </w:rPr>
-        <w:t xml:space="preserve"> H, et al. Teaching Effectiveness of the Advanced Trauma Life Support Program as Demonstrated by an Objective Structured Clinical Examination for Practicing Physicians. World Journal of Surgery. 1996 Oct;20(8):1121–6. </w:t>
+        <w:t xml:space="preserve">Ali J, Cohen R, Adam R, Theophilus J. G, Pierre I, Bedaysie H, et al. Teaching Effectiveness of the Advanced Trauma Life Support Program as Demonstrated by an Objective Structured Clinical Examination for Practicing Physicians. World Journal of Surgery. 1996 Oct;20(8):1121–6. </w:t>
       </w:r>
     </w:p>
     <w:p>
@@ -8255,25 +7849,7 @@
           <w:lang w:val="en-GB"/>
         </w:rPr>
         <w:tab/>
-        <w:t xml:space="preserve">Ali J, Adam RU, Josa D, Pierre I, </w:t>
-      </w:r>
-      <w:proofErr w:type="spellStart"/>
-      <w:r>
-        <w:rPr>
-          <w:rFonts w:eastAsia="Arial Unicode MS"/>
-          <w:bdr w:val="nil"/>
-          <w:lang w:val="en-GB"/>
-        </w:rPr>
-        <w:t>Bedaysie</w:t>
-      </w:r>
-      <w:proofErr w:type="spellEnd"/>
-      <w:r>
-        <w:rPr>
-          <w:rFonts w:eastAsia="Arial Unicode MS"/>
-          <w:bdr w:val="nil"/>
-          <w:lang w:val="en-GB"/>
-        </w:rPr>
-        <w:t xml:space="preserve"> H, West U, et al. Comparison of Performance of Interns Completing the Old (1993) and New Interactive (1997) Advanced Trauma Life Support Courses. The Journal of Trauma: Injury, Infection, and Critical Care. 1999 Jan;46(1):80–6. </w:t>
+        <w:t xml:space="preserve">Ali J, Adam RU, Josa D, Pierre I, Bedaysie H, West U, et al. Comparison of Performance of Interns Completing the Old (1993) and New Interactive (1997) Advanced Trauma Life Support Courses. The Journal of Trauma: Injury, Infection, and Critical Care. 1999 Jan;46(1):80–6. </w:t>
       </w:r>
     </w:p>
     <w:p>
@@ -8301,97 +7877,7 @@
           <w:lang w:val="en-GB"/>
         </w:rPr>
         <w:tab/>
-        <w:t xml:space="preserve">Putra AB, </w:t>
-      </w:r>
-      <w:proofErr w:type="spellStart"/>
-      <w:r>
-        <w:rPr>
-          <w:rFonts w:eastAsia="Arial Unicode MS"/>
-          <w:bdr w:val="nil"/>
-          <w:lang w:val="en-GB"/>
-        </w:rPr>
-        <w:t>Nurachman</w:t>
-      </w:r>
-      <w:proofErr w:type="spellEnd"/>
-      <w:r>
-        <w:rPr>
-          <w:rFonts w:eastAsia="Arial Unicode MS"/>
-          <w:bdr w:val="nil"/>
-          <w:lang w:val="en-GB"/>
-        </w:rPr>
-        <w:t xml:space="preserve"> LA, </w:t>
-      </w:r>
-      <w:proofErr w:type="spellStart"/>
-      <w:r>
-        <w:rPr>
-          <w:rFonts w:eastAsia="Arial Unicode MS"/>
-          <w:bdr w:val="nil"/>
-          <w:lang w:val="en-GB"/>
-        </w:rPr>
-        <w:t>Suryawiditya</w:t>
-      </w:r>
-      <w:proofErr w:type="spellEnd"/>
-      <w:r>
-        <w:rPr>
-          <w:rFonts w:eastAsia="Arial Unicode MS"/>
-          <w:bdr w:val="nil"/>
-          <w:lang w:val="en-GB"/>
-        </w:rPr>
-        <w:t xml:space="preserve"> BA, </w:t>
-      </w:r>
-      <w:proofErr w:type="spellStart"/>
-      <w:r>
-        <w:rPr>
-          <w:rFonts w:eastAsia="Arial Unicode MS"/>
-          <w:bdr w:val="nil"/>
-          <w:lang w:val="en-GB"/>
-        </w:rPr>
-        <w:t>Risyaldi</w:t>
-      </w:r>
-      <w:proofErr w:type="spellEnd"/>
-      <w:r>
-        <w:rPr>
-          <w:rFonts w:eastAsia="Arial Unicode MS"/>
-          <w:bdr w:val="nil"/>
-          <w:lang w:val="en-GB"/>
-        </w:rPr>
-        <w:t xml:space="preserve"> M, </w:t>
-      </w:r>
-      <w:proofErr w:type="spellStart"/>
-      <w:r>
-        <w:rPr>
-          <w:rFonts w:eastAsia="Arial Unicode MS"/>
-          <w:bdr w:val="nil"/>
-          <w:lang w:val="en-GB"/>
-        </w:rPr>
-        <w:t>Sihardo</w:t>
-      </w:r>
-      <w:proofErr w:type="spellEnd"/>
-      <w:r>
-        <w:rPr>
-          <w:rFonts w:eastAsia="Arial Unicode MS"/>
-          <w:bdr w:val="nil"/>
-          <w:lang w:val="en-GB"/>
-        </w:rPr>
-        <w:t xml:space="preserve"> L. Impact of Advanced Trauma Life Support Training for Improving Mortality Outcome: A Systematic Review and Meta-analysis. The New </w:t>
-      </w:r>
-      <w:proofErr w:type="spellStart"/>
-      <w:r>
-        <w:rPr>
-          <w:rFonts w:eastAsia="Arial Unicode MS"/>
-          <w:bdr w:val="nil"/>
-          <w:lang w:val="en-GB"/>
-        </w:rPr>
-        <w:t>Ropanasury</w:t>
-      </w:r>
-      <w:proofErr w:type="spellEnd"/>
-      <w:r>
-        <w:rPr>
-          <w:rFonts w:eastAsia="Arial Unicode MS"/>
-          <w:bdr w:val="nil"/>
-          <w:lang w:val="en-GB"/>
-        </w:rPr>
-        <w:t xml:space="preserve"> Journal of Surgery [Internet]. 2023 June;8(2). Available from: http://dx.doi.org/10.7454/nrjs.v8i2.1152</w:t>
+        <w:t>Putra AB, Nurachman LA, Suryawiditya BA, Risyaldi M, Sihardo L. Impact of Advanced Trauma Life Support Training for Improving Mortality Outcome: A Systematic Review and Meta-analysis. The New Ropanasury Journal of Surgery [Internet]. 2023 June;8(2). Available from: http://dx.doi.org/10.7454/nrjs.v8i2.1152</w:t>
       </w:r>
     </w:p>
     <w:p>
@@ -8418,25 +7904,7 @@
           <w:lang w:val="en-GB"/>
         </w:rPr>
         <w:tab/>
-        <w:t xml:space="preserve">Vestrup JA, </w:t>
-      </w:r>
-      <w:proofErr w:type="spellStart"/>
-      <w:r>
-        <w:rPr>
-          <w:rFonts w:eastAsia="Arial Unicode MS"/>
-          <w:bdr w:val="nil"/>
-          <w:lang w:val="en-GB"/>
-        </w:rPr>
-        <w:t>Stormorken</w:t>
-      </w:r>
-      <w:proofErr w:type="spellEnd"/>
-      <w:r>
-        <w:rPr>
-          <w:rFonts w:eastAsia="Arial Unicode MS"/>
-          <w:bdr w:val="nil"/>
-          <w:lang w:val="en-GB"/>
-        </w:rPr>
-        <w:t xml:space="preserve"> A, Wood V. Impact of advanced trauma life support training on early trauma management. The American Journal of Surgery. 1988 May;155(5):704–7. </w:t>
+        <w:t xml:space="preserve">Vestrup JA, Stormorken A, Wood V. Impact of advanced trauma life support training on early trauma management. The American Journal of Surgery. 1988 May;155(5):704–7. </w:t>
       </w:r>
     </w:p>
     <w:p>
@@ -8490,25 +7958,7 @@
           <w:lang w:val="en-GB"/>
         </w:rPr>
         <w:tab/>
-        <w:t xml:space="preserve">van Olden GDJ, Dik Meeuwis J, Bolhuis HW, </w:t>
-      </w:r>
-      <w:proofErr w:type="spellStart"/>
-      <w:r>
-        <w:rPr>
-          <w:rFonts w:eastAsia="Arial Unicode MS"/>
-          <w:bdr w:val="nil"/>
-          <w:lang w:val="en-GB"/>
-        </w:rPr>
-        <w:t>Boxma</w:t>
-      </w:r>
-      <w:proofErr w:type="spellEnd"/>
-      <w:r>
-        <w:rPr>
-          <w:rFonts w:eastAsia="Arial Unicode MS"/>
-          <w:bdr w:val="nil"/>
-          <w:lang w:val="en-GB"/>
-        </w:rPr>
-        <w:t xml:space="preserve"> H, Goris RJA. Clinical impact of advanced trauma life support. The American Journal of Emergency Medicine. 2004 Nov;22(7):522–5. </w:t>
+        <w:t xml:space="preserve">van Olden GDJ, Dik Meeuwis J, Bolhuis HW, Boxma H, Goris RJA. Clinical impact of advanced trauma life support. The American Journal of Emergency Medicine. 2004 Nov;22(7):522–5. </w:t>
       </w:r>
     </w:p>
     <w:p>
@@ -8589,25 +8039,7 @@
           <w:lang w:val="en-GB"/>
         </w:rPr>
         <w:tab/>
-        <w:t xml:space="preserve">Hashmi ZG, Haider AH, Zafar SN, </w:t>
-      </w:r>
-      <w:proofErr w:type="spellStart"/>
-      <w:r>
-        <w:rPr>
-          <w:rFonts w:eastAsia="Arial Unicode MS"/>
-          <w:bdr w:val="nil"/>
-          <w:lang w:val="en-GB"/>
-        </w:rPr>
-        <w:t>Kisat</w:t>
-      </w:r>
-      <w:proofErr w:type="spellEnd"/>
-      <w:r>
-        <w:rPr>
-          <w:rFonts w:eastAsia="Arial Unicode MS"/>
-          <w:bdr w:val="nil"/>
-          <w:lang w:val="en-GB"/>
-        </w:rPr>
-        <w:t xml:space="preserve"> M, Moosa A, Siddiqui F, et al. Hospital-based trauma quality improvement initiatives: First step toward improving trauma outcomes in the developing world. Journal of Trauma and Acute Care Surgery. 2013 July;75(1):60–8. </w:t>
+        <w:t xml:space="preserve">Hashmi ZG, Haider AH, Zafar SN, Kisat M, Moosa A, Siddiqui F, et al. Hospital-based trauma quality improvement initiatives: First step toward improving trauma outcomes in the developing world. Journal of Trauma and Acute Care Surgery. 2013 July;75(1):60–8. </w:t>
       </w:r>
     </w:p>
     <w:p>
@@ -8634,60 +8066,7 @@
           <w:lang w:val="en-GB"/>
         </w:rPr>
         <w:tab/>
-      </w:r>
-      <w:proofErr w:type="spellStart"/>
-      <w:r>
-        <w:rPr>
-          <w:rFonts w:eastAsia="Arial Unicode MS"/>
-          <w:bdr w:val="nil"/>
-          <w:lang w:val="en-GB"/>
-        </w:rPr>
-        <w:t>Petroze</w:t>
-      </w:r>
-      <w:proofErr w:type="spellEnd"/>
-      <w:r>
-        <w:rPr>
-          <w:rFonts w:eastAsia="Arial Unicode MS"/>
-          <w:bdr w:val="nil"/>
-          <w:lang w:val="en-GB"/>
-        </w:rPr>
-        <w:t xml:space="preserve"> RT, </w:t>
-      </w:r>
-      <w:proofErr w:type="spellStart"/>
-      <w:r>
-        <w:rPr>
-          <w:rFonts w:eastAsia="Arial Unicode MS"/>
-          <w:bdr w:val="nil"/>
-          <w:lang w:val="en-GB"/>
-        </w:rPr>
-        <w:t>Byiringiro</w:t>
-      </w:r>
-      <w:proofErr w:type="spellEnd"/>
-      <w:r>
-        <w:rPr>
-          <w:rFonts w:eastAsia="Arial Unicode MS"/>
-          <w:bdr w:val="nil"/>
-          <w:lang w:val="en-GB"/>
-        </w:rPr>
-        <w:t xml:space="preserve"> JC, </w:t>
-      </w:r>
-      <w:proofErr w:type="spellStart"/>
-      <w:r>
-        <w:rPr>
-          <w:rFonts w:eastAsia="Arial Unicode MS"/>
-          <w:bdr w:val="nil"/>
-          <w:lang w:val="en-GB"/>
-        </w:rPr>
-        <w:t>Ntakiyiruta</w:t>
-      </w:r>
-      <w:proofErr w:type="spellEnd"/>
-      <w:r>
-        <w:rPr>
-          <w:rFonts w:eastAsia="Arial Unicode MS"/>
-          <w:bdr w:val="nil"/>
-          <w:lang w:val="en-GB"/>
-        </w:rPr>
-        <w:t xml:space="preserve"> G, Briggs SM, Deckelbaum DL, Razek T, et al. Can Focused Trauma Education Initiatives Reduce Mortality or Improve Resource Utilization in a Low-Resource Setting? World Journal of Surgery. 2014 Dec;39(4):926–33. </w:t>
+        <w:t xml:space="preserve">Petroze RT, Byiringiro JC, Ntakiyiruta G, Briggs SM, Deckelbaum DL, Razek T, et al. Can Focused Trauma Education Initiatives Reduce Mortality or Improve Resource Utilization in a Low-Resource Setting? World Journal of Surgery. 2014 Dec;39(4):926–33. </w:t>
       </w:r>
     </w:p>
     <w:p>
@@ -8714,151 +8093,7 @@
           <w:lang w:val="en-GB"/>
         </w:rPr>
         <w:tab/>
-        <w:t xml:space="preserve">Bellanova G, </w:t>
-      </w:r>
-      <w:proofErr w:type="spellStart"/>
-      <w:r>
-        <w:rPr>
-          <w:rFonts w:eastAsia="Arial Unicode MS"/>
-          <w:bdr w:val="nil"/>
-          <w:lang w:val="en-GB"/>
-        </w:rPr>
-        <w:t>Buccelletti</w:t>
-      </w:r>
-      <w:proofErr w:type="spellEnd"/>
-      <w:r>
-        <w:rPr>
-          <w:rFonts w:eastAsia="Arial Unicode MS"/>
-          <w:bdr w:val="nil"/>
-          <w:lang w:val="en-GB"/>
-        </w:rPr>
-        <w:t xml:space="preserve"> F, </w:t>
-      </w:r>
-      <w:proofErr w:type="spellStart"/>
-      <w:r>
-        <w:rPr>
-          <w:rFonts w:eastAsia="Arial Unicode MS"/>
-          <w:bdr w:val="nil"/>
-          <w:lang w:val="en-GB"/>
-        </w:rPr>
-        <w:t>Berletti</w:t>
-      </w:r>
-      <w:proofErr w:type="spellEnd"/>
-      <w:r>
-        <w:rPr>
-          <w:rFonts w:eastAsia="Arial Unicode MS"/>
-          <w:bdr w:val="nil"/>
-          <w:lang w:val="en-GB"/>
-        </w:rPr>
-        <w:t xml:space="preserve"> R, </w:t>
-      </w:r>
-      <w:proofErr w:type="spellStart"/>
-      <w:r>
-        <w:rPr>
-          <w:rFonts w:eastAsia="Arial Unicode MS"/>
-          <w:bdr w:val="nil"/>
-          <w:lang w:val="en-GB"/>
-        </w:rPr>
-        <w:t>Cavana</w:t>
-      </w:r>
-      <w:proofErr w:type="spellEnd"/>
-      <w:r>
-        <w:rPr>
-          <w:rFonts w:eastAsia="Arial Unicode MS"/>
-          <w:bdr w:val="nil"/>
-          <w:lang w:val="en-GB"/>
-        </w:rPr>
-        <w:t xml:space="preserve"> M, </w:t>
-      </w:r>
-      <w:proofErr w:type="spellStart"/>
-      <w:r>
-        <w:rPr>
-          <w:rFonts w:eastAsia="Arial Unicode MS"/>
-          <w:bdr w:val="nil"/>
-          <w:lang w:val="en-GB"/>
-        </w:rPr>
-        <w:t>Folgheraiter</w:t>
-      </w:r>
-      <w:proofErr w:type="spellEnd"/>
-      <w:r>
-        <w:rPr>
-          <w:rFonts w:eastAsia="Arial Unicode MS"/>
-          <w:bdr w:val="nil"/>
-          <w:lang w:val="en-GB"/>
-        </w:rPr>
-        <w:t xml:space="preserve"> G, </w:t>
-      </w:r>
-      <w:proofErr w:type="spellStart"/>
-      <w:r>
-        <w:rPr>
-          <w:rFonts w:eastAsia="Arial Unicode MS"/>
-          <w:bdr w:val="nil"/>
-          <w:lang w:val="en-GB"/>
-        </w:rPr>
-        <w:t>Groppo</w:t>
-      </w:r>
-      <w:proofErr w:type="spellEnd"/>
-      <w:r>
-        <w:rPr>
-          <w:rFonts w:eastAsia="Arial Unicode MS"/>
-          <w:bdr w:val="nil"/>
-          <w:lang w:val="en-GB"/>
-        </w:rPr>
-        <w:t xml:space="preserve"> F, et al. </w:t>
-      </w:r>
-      <w:proofErr w:type="gramStart"/>
-      <w:r>
-        <w:rPr>
-          <w:rFonts w:eastAsia="Arial Unicode MS"/>
-          <w:bdr w:val="nil"/>
-          <w:lang w:val="en-GB"/>
-        </w:rPr>
-        <w:t>How</w:t>
-      </w:r>
-      <w:proofErr w:type="gramEnd"/>
-      <w:r>
-        <w:rPr>
-          <w:rFonts w:eastAsia="Arial Unicode MS"/>
-          <w:bdr w:val="nil"/>
-          <w:lang w:val="en-GB"/>
-        </w:rPr>
-        <w:t xml:space="preserve"> formative courses about damage control surgery and non-operative management improved outcome and survival in unstable </w:t>
-      </w:r>
-      <w:proofErr w:type="spellStart"/>
-      <w:r>
-        <w:rPr>
-          <w:rFonts w:eastAsia="Arial Unicode MS"/>
-          <w:bdr w:val="nil"/>
-          <w:lang w:val="en-GB"/>
-        </w:rPr>
-        <w:t>politrauma</w:t>
-      </w:r>
-      <w:proofErr w:type="spellEnd"/>
-      <w:r>
-        <w:rPr>
-          <w:rFonts w:eastAsia="Arial Unicode MS"/>
-          <w:bdr w:val="nil"/>
-          <w:lang w:val="en-GB"/>
-        </w:rPr>
-        <w:t xml:space="preserve"> patients in a Mountain Trauma </w:t>
-      </w:r>
-      <w:proofErr w:type="spellStart"/>
-      <w:r>
-        <w:rPr>
-          <w:rFonts w:eastAsia="Arial Unicode MS"/>
-          <w:bdr w:val="nil"/>
-          <w:lang w:val="en-GB"/>
-        </w:rPr>
-        <w:t>Center</w:t>
-      </w:r>
-      <w:proofErr w:type="spellEnd"/>
-      <w:r>
-        <w:rPr>
-          <w:rFonts w:eastAsia="Arial Unicode MS"/>
-          <w:bdr w:val="nil"/>
-          <w:lang w:val="en-GB"/>
-        </w:rPr>
-        <w:t xml:space="preserve">. Ann Ital Chir. 2016;87(1):68–74. </w:t>
+        <w:t xml:space="preserve">Bellanova G, Buccelletti F, Berletti R, Cavana M, Folgheraiter G, Groppo F, et al. How formative courses about damage control surgery and non-operative management improved outcome and survival in unstable politrauma patients in a Mountain Trauma Center. Ann Ital Chir. 2016;87(1):68–74. </w:t>
       </w:r>
     </w:p>
     <w:p>
@@ -8885,79 +8120,7 @@
           <w:lang w:val="en-GB"/>
         </w:rPr>
         <w:tab/>
-        <w:t xml:space="preserve">Magnone S, Allegri A, Belotti E, Castelli CC, </w:t>
-      </w:r>
-      <w:proofErr w:type="spellStart"/>
-      <w:r>
-        <w:rPr>
-          <w:rFonts w:eastAsia="Arial Unicode MS"/>
-          <w:bdr w:val="nil"/>
-          <w:lang w:val="en-GB"/>
-        </w:rPr>
-        <w:t>Ceresoli</w:t>
-      </w:r>
-      <w:proofErr w:type="spellEnd"/>
-      <w:r>
-        <w:rPr>
-          <w:rFonts w:eastAsia="Arial Unicode MS"/>
-          <w:bdr w:val="nil"/>
-          <w:lang w:val="en-GB"/>
-        </w:rPr>
-        <w:t xml:space="preserve"> M, </w:t>
-      </w:r>
-      <w:proofErr w:type="spellStart"/>
-      <w:r>
-        <w:rPr>
-          <w:rFonts w:eastAsia="Arial Unicode MS"/>
-          <w:bdr w:val="nil"/>
-          <w:lang w:val="en-GB"/>
-        </w:rPr>
-        <w:t>Coccolini</w:t>
-      </w:r>
-      <w:proofErr w:type="spellEnd"/>
-      <w:r>
-        <w:rPr>
-          <w:rFonts w:eastAsia="Arial Unicode MS"/>
-          <w:bdr w:val="nil"/>
-          <w:lang w:val="en-GB"/>
-        </w:rPr>
-        <w:t xml:space="preserve"> F, et al. Impact of ATLS Guidelines and Trauma Team Introduction </w:t>
-      </w:r>
-      <w:proofErr w:type="gramStart"/>
-      <w:r>
-        <w:rPr>
-          <w:rFonts w:eastAsia="Arial Unicode MS"/>
-          <w:bdr w:val="nil"/>
-          <w:lang w:val="en-GB"/>
-        </w:rPr>
-        <w:t>an</w:t>
-      </w:r>
-      <w:proofErr w:type="gramEnd"/>
-      <w:r>
-        <w:rPr>
-          <w:rFonts w:eastAsia="Arial Unicode MS"/>
-          <w:bdr w:val="nil"/>
-          <w:lang w:val="en-GB"/>
-        </w:rPr>
-        <w:t xml:space="preserve"> 24 </w:t>
-      </w:r>
-      <w:proofErr w:type="gramStart"/>
-      <w:r>
-        <w:rPr>
-          <w:rFonts w:eastAsia="Arial Unicode MS"/>
-          <w:bdr w:val="nil"/>
-          <w:lang w:val="en-GB"/>
-        </w:rPr>
-        <w:t>Hours</w:t>
-      </w:r>
-      <w:proofErr w:type="gramEnd"/>
-      <w:r>
-        <w:rPr>
-          <w:rFonts w:eastAsia="Arial Unicode MS"/>
-          <w:bdr w:val="nil"/>
-          <w:lang w:val="en-GB"/>
-        </w:rPr>
-        <w:t xml:space="preserve"> Mortality in Severe Trauma in a Busy Italian Metropolitan Hospital: a Case Control Study. Turkish Journal of Trauma and Emergency Surgery [Internet]. 2015; Available from: http://dx.doi.org/10.5505/tjtes.2015.19540</w:t>
+        <w:t>Magnone S, Allegri A, Belotti E, Castelli CC, Ceresoli M, Coccolini F, et al. Impact of ATLS Guidelines and Trauma Team Introduction an 24 Hours Mortality in Severe Trauma in a Busy Italian Metropolitan Hospital: a Case Control Study. Turkish Journal of Trauma and Emergency Surgery [Internet]. 2015; Available from: http://dx.doi.org/10.5505/tjtes.2015.19540</w:t>
       </w:r>
     </w:p>
     <w:p>
@@ -8984,43 +8147,7 @@
           <w:lang w:val="en-GB"/>
         </w:rPr>
         <w:tab/>
-        <w:t xml:space="preserve">Kamau C, </w:t>
-      </w:r>
-      <w:proofErr w:type="spellStart"/>
-      <w:r>
-        <w:rPr>
-          <w:rFonts w:eastAsia="Arial Unicode MS"/>
-          <w:bdr w:val="nil"/>
-          <w:lang w:val="en-GB"/>
-        </w:rPr>
-        <w:t>Chikophe</w:t>
-      </w:r>
-      <w:proofErr w:type="spellEnd"/>
-      <w:r>
-        <w:rPr>
-          <w:rFonts w:eastAsia="Arial Unicode MS"/>
-          <w:bdr w:val="nil"/>
-          <w:lang w:val="en-GB"/>
-        </w:rPr>
-        <w:t xml:space="preserve"> I, Abdallah A, Mogere E. Impact of advanced trauma life support training on 30-day mortality in severely injured patients at a Kenyan tertiary </w:t>
-      </w:r>
-      <w:proofErr w:type="spellStart"/>
-      <w:r>
-        <w:rPr>
-          <w:rFonts w:eastAsia="Arial Unicode MS"/>
-          <w:bdr w:val="nil"/>
-          <w:lang w:val="en-GB"/>
-        </w:rPr>
-        <w:t>center</w:t>
-      </w:r>
-      <w:proofErr w:type="spellEnd"/>
-      <w:r>
-        <w:rPr>
-          <w:rFonts w:eastAsia="Arial Unicode MS"/>
-          <w:bdr w:val="nil"/>
-          <w:lang w:val="en-GB"/>
-        </w:rPr>
-        <w:t xml:space="preserve">: a retrospective matched case-control study. International Journal of Emergency Medicine. 2024 Oct 10;17(1):153. </w:t>
+        <w:t xml:space="preserve">Kamau C, Chikophe I, Abdallah A, Mogere E. Impact of advanced trauma life support training on 30-day mortality in severely injured patients at a Kenyan tertiary center: a retrospective matched case-control study. International Journal of Emergency Medicine. 2024 Oct 10;17(1):153. </w:t>
       </w:r>
     </w:p>
     <w:p>
@@ -9047,25 +8174,7 @@
           <w:lang w:val="en-GB"/>
         </w:rPr>
         <w:tab/>
-        <w:t>Gerdin Wärnberg M, Berg J, Bhandarkar P, Chatterjee A, Chatterjee S, Chintamani C, et al. A pilot multicentre cluster randomised trial to compare the effect of trauma life support training programmes on patient and provider outcomes. BMJ Open. 2022 Apr;12(4</w:t>
-      </w:r>
-      <w:proofErr w:type="gramStart"/>
-      <w:r>
-        <w:rPr>
-          <w:rFonts w:eastAsia="Arial Unicode MS"/>
-          <w:bdr w:val="nil"/>
-          <w:lang w:val="en-GB"/>
-        </w:rPr>
-        <w:t>):e</w:t>
-      </w:r>
-      <w:proofErr w:type="gramEnd"/>
-      <w:r>
-        <w:rPr>
-          <w:rFonts w:eastAsia="Arial Unicode MS"/>
-          <w:bdr w:val="nil"/>
-          <w:lang w:val="en-GB"/>
-        </w:rPr>
-        <w:t xml:space="preserve">057504. </w:t>
+        <w:t xml:space="preserve">Gerdin Wärnberg M, Berg J, Bhandarkar P, Chatterjee A, Chatterjee S, Chintamani C, et al. A pilot multicentre cluster randomised trial to compare the effect of trauma life support training programmes on patient and provider outcomes. BMJ Open. 2022 Apr;12(4):e057504. </w:t>
       </w:r>
     </w:p>
     <w:p>
@@ -9093,43 +8202,7 @@
           <w:lang w:val="en-GB"/>
         </w:rPr>
         <w:tab/>
-        <w:t xml:space="preserve">Gerdin Wärnberg M, Basak D, Berg J, Chatterjee S, </w:t>
-      </w:r>
-      <w:proofErr w:type="spellStart"/>
-      <w:r>
-        <w:rPr>
-          <w:rFonts w:eastAsia="Arial Unicode MS"/>
-          <w:bdr w:val="nil"/>
-          <w:lang w:val="en-GB"/>
-        </w:rPr>
-        <w:t>Felländer</w:t>
-      </w:r>
-      <w:proofErr w:type="spellEnd"/>
-      <w:r>
-        <w:rPr>
-          <w:rFonts w:eastAsia="Arial Unicode MS"/>
-          <w:bdr w:val="nil"/>
-          <w:lang w:val="en-GB"/>
-        </w:rPr>
-        <w:t xml:space="preserve">-Tsai L, Ghag G, et al. Feasibility of a Cluster Randomised Trial on the Effect of Trauma Life Support Training: A Pilot Study. </w:t>
-      </w:r>
-      <w:proofErr w:type="spellStart"/>
-      <w:r>
-        <w:rPr>
-          <w:rFonts w:eastAsia="Arial Unicode MS"/>
-          <w:bdr w:val="nil"/>
-          <w:lang w:val="en-GB"/>
-        </w:rPr>
-        <w:t>medRxiv</w:t>
-      </w:r>
-      <w:proofErr w:type="spellEnd"/>
-      <w:r>
-        <w:rPr>
-          <w:rFonts w:eastAsia="Arial Unicode MS"/>
-          <w:bdr w:val="nil"/>
-          <w:lang w:val="en-GB"/>
-        </w:rPr>
-        <w:t xml:space="preserve">. 2024 Nov 26;2024.03.13.24304236. </w:t>
+        <w:t xml:space="preserve">Gerdin Wärnberg M, Basak D, Berg J, Chatterjee S, Felländer-Tsai L, Ghag G, et al. Feasibility of a Cluster Randomised Trial on the Effect of Trauma Life Support Training: A Pilot Study. medRxiv. 2024 Nov 26;2024.03.13.24304236. </w:t>
       </w:r>
     </w:p>
     <w:p>
@@ -9156,25 +8229,7 @@
           <w:lang w:val="en-GB"/>
         </w:rPr>
         <w:tab/>
-        <w:t xml:space="preserve">David S, Gerdin Wärnberg M, Trauma life support training Effectiveness Research Network (TERN) Collaborators. Patient-reported outcomes relevant to post-discharge trauma patients in urban India [Internet]. </w:t>
-      </w:r>
-      <w:proofErr w:type="spellStart"/>
-      <w:r>
-        <w:rPr>
-          <w:rFonts w:eastAsia="Arial Unicode MS"/>
-          <w:bdr w:val="nil"/>
-          <w:lang w:val="en-GB"/>
-        </w:rPr>
-        <w:t>medRxiv</w:t>
-      </w:r>
-      <w:proofErr w:type="spellEnd"/>
-      <w:r>
-        <w:rPr>
-          <w:rFonts w:eastAsia="Arial Unicode MS"/>
-          <w:bdr w:val="nil"/>
-          <w:lang w:val="en-GB"/>
-        </w:rPr>
-        <w:t>; 2024 [cited 2024 Nov 11]. p. 2024.02.20.24302971. Available from: https://www.medrxiv.org/content/10.1101/2024.02.20.24302971v2</w:t>
+        <w:t>David S, Gerdin Wärnberg M, Trauma life support training Effectiveness Research Network (TERN) Collaborators. Patient-reported outcomes relevant to post-discharge trauma patients in urban India [Internet]. medRxiv; 2024 [cited 2024 Nov 11]. p. 2024.02.20.24302971. Available from: https://www.medrxiv.org/content/10.1101/2024.02.20.24302971v2</w:t>
       </w:r>
     </w:p>
     <w:p>
@@ -9201,25 +8256,7 @@
           <w:lang w:val="en-GB"/>
         </w:rPr>
         <w:tab/>
-        <w:t xml:space="preserve">Hemming K, Haines TP, Chilton PJ, Girling AJ, </w:t>
-      </w:r>
-      <w:proofErr w:type="spellStart"/>
-      <w:r>
-        <w:rPr>
-          <w:rFonts w:eastAsia="Arial Unicode MS"/>
-          <w:bdr w:val="nil"/>
-          <w:lang w:val="en-GB"/>
-        </w:rPr>
-        <w:t>Lilford</w:t>
-      </w:r>
-      <w:proofErr w:type="spellEnd"/>
-      <w:r>
-        <w:rPr>
-          <w:rFonts w:eastAsia="Arial Unicode MS"/>
-          <w:bdr w:val="nil"/>
-          <w:lang w:val="en-GB"/>
-        </w:rPr>
-        <w:t xml:space="preserve"> RJ. The stepped wedge cluster randomised trial: rationale, design, analysis, and reporting. BMJ. 2015 Feb 6;350(feb06 1):h391–h391. </w:t>
+        <w:t xml:space="preserve">Hemming K, Haines TP, Chilton PJ, Girling AJ, Lilford RJ. The stepped wedge cluster randomised trial: rationale, design, analysis, and reporting. BMJ. 2015 Feb 6;350(feb06 1):h391–h391. </w:t>
       </w:r>
     </w:p>
     <w:p>
@@ -9354,43 +8391,7 @@
           <w:lang w:val="en-GB"/>
         </w:rPr>
         <w:tab/>
-        <w:t xml:space="preserve">Campbell MK, </w:t>
-      </w:r>
-      <w:proofErr w:type="spellStart"/>
-      <w:r>
-        <w:rPr>
-          <w:rFonts w:eastAsia="Arial Unicode MS"/>
-          <w:bdr w:val="nil"/>
-          <w:lang w:val="en-GB"/>
-        </w:rPr>
-        <w:t>Fayers</w:t>
-      </w:r>
-      <w:proofErr w:type="spellEnd"/>
-      <w:r>
-        <w:rPr>
-          <w:rFonts w:eastAsia="Arial Unicode MS"/>
-          <w:bdr w:val="nil"/>
-          <w:lang w:val="en-GB"/>
-        </w:rPr>
-        <w:t xml:space="preserve"> PM, Grimshaw JM. Determinants of the </w:t>
-      </w:r>
-      <w:proofErr w:type="spellStart"/>
-      <w:r>
-        <w:rPr>
-          <w:rFonts w:eastAsia="Arial Unicode MS"/>
-          <w:bdr w:val="nil"/>
-          <w:lang w:val="en-GB"/>
-        </w:rPr>
-        <w:t>intracluster</w:t>
-      </w:r>
-      <w:proofErr w:type="spellEnd"/>
-      <w:r>
-        <w:rPr>
-          <w:rFonts w:eastAsia="Arial Unicode MS"/>
-          <w:bdr w:val="nil"/>
-          <w:lang w:val="en-GB"/>
-        </w:rPr>
-        <w:t xml:space="preserve"> correlation coefficient in cluster randomized trials: the case of implementation research. Clinical Trials. 2005 Apr;2(2):99–107. </w:t>
+        <w:t xml:space="preserve">Campbell MK, Fayers PM, Grimshaw JM. Determinants of the intracluster correlation coefficient in cluster randomized trials: the case of implementation research. Clinical Trials. 2005 Apr;2(2):99–107. </w:t>
       </w:r>
     </w:p>
     <w:p>
@@ -9444,25 +8445,7 @@
           <w:lang w:val="en-GB"/>
         </w:rPr>
         <w:tab/>
-        <w:t xml:space="preserve">Martin J, Girling A, </w:t>
-      </w:r>
-      <w:proofErr w:type="spellStart"/>
-      <w:r>
-        <w:rPr>
-          <w:rFonts w:eastAsia="Arial Unicode MS"/>
-          <w:bdr w:val="nil"/>
-          <w:lang w:val="en-GB"/>
-        </w:rPr>
-        <w:t>Nirantharakumar</w:t>
-      </w:r>
-      <w:proofErr w:type="spellEnd"/>
-      <w:r>
-        <w:rPr>
-          <w:rFonts w:eastAsia="Arial Unicode MS"/>
-          <w:bdr w:val="nil"/>
-          <w:lang w:val="en-GB"/>
-        </w:rPr>
-        <w:t xml:space="preserve"> K, Ryan R, Marshall T, Hemming K. Intra-cluster and inter-period correlation coefficients for cross-sectional cluster randomised controlled trials for type-2 diabetes in UK primary care. Trials [Internet]. 2016 Aug;17(1). Available from: http://dx.doi.org/10.1186/s13063-016-1532-9</w:t>
+        <w:t>Martin J, Girling A, Nirantharakumar K, Ryan R, Marshall T, Hemming K. Intra-cluster and inter-period correlation coefficients for cross-sectional cluster randomised controlled trials for type-2 diabetes in UK primary care. Trials [Internet]. 2016 Aug;17(1). Available from: http://dx.doi.org/10.1186/s13063-016-1532-9</w:t>
       </w:r>
     </w:p>
     <w:p>
@@ -9489,308 +8472,77 @@
           <w:lang w:val="sv-SE"/>
         </w:rPr>
         <w:tab/>
-      </w:r>
-      <w:proofErr w:type="spellStart"/>
-      <w:r>
+        <w:t xml:space="preserve">Korevaar E, Kasza J, Taljaard M, Hemming K, Haines T, Turner EL, et al. </w:t>
+      </w:r>
+      <w:r>
+        <w:rPr>
+          <w:rFonts w:eastAsia="Arial Unicode MS"/>
+          <w:bdr w:val="nil"/>
+          <w:lang w:val="en-GB"/>
+        </w:rPr>
+        <w:t xml:space="preserve">Intra-cluster correlations from the CLustered OUtcome Dataset bank to inform the design of longitudinal cluster trials. Clinical Trials. 2021 June;18(5):529–40. </w:t>
+      </w:r>
+    </w:p>
+    <w:p>
+      <w:pPr>
+        <w:pStyle w:val="Bibliography"/>
         <w:rPr>
           <w:rFonts w:eastAsia="Arial Unicode MS"/>
           <w:bdr w:val="nil"/>
           <w:lang w:val="sv-SE"/>
         </w:rPr>
-        <w:t>Korevaar</w:t>
-      </w:r>
-      <w:proofErr w:type="spellEnd"/>
+      </w:pPr>
+      <w:r>
+        <w:rPr>
+          <w:rFonts w:eastAsia="Arial Unicode MS"/>
+          <w:bdr w:val="nil"/>
+          <w:lang w:val="en-GB"/>
+        </w:rPr>
+        <w:t>41.</w:t>
+      </w:r>
+      <w:r>
+        <w:rPr>
+          <w:rFonts w:eastAsia="Arial Unicode MS"/>
+          <w:bdr w:val="nil"/>
+          <w:lang w:val="en-GB"/>
+        </w:rPr>
+        <w:tab/>
+        <w:t xml:space="preserve">Lashoher A, Schneider EB, Juillard C, Stevens K, Colantuoni E, Berry WR, et al. Implementation of the World Health Organization Trauma Care Checklist Program in 11 Centers Across Multiple Economic Strata: Effect on Care Process Measures. </w:t>
+      </w:r>
       <w:r>
         <w:rPr>
           <w:rFonts w:eastAsia="Arial Unicode MS"/>
           <w:bdr w:val="nil"/>
           <w:lang w:val="sv-SE"/>
         </w:rPr>
-        <w:t xml:space="preserve"> E, </w:t>
-      </w:r>
-      <w:proofErr w:type="spellStart"/>
+        <w:t xml:space="preserve">World J Surg. 2017 Apr;41(4):954–62. </w:t>
+      </w:r>
+    </w:p>
+    <w:p>
+      <w:pPr>
+        <w:pStyle w:val="Bibliography"/>
+        <w:rPr>
+          <w:rFonts w:eastAsia="Arial Unicode MS"/>
+          <w:bdr w:val="nil"/>
+          <w:lang w:val="en-GB"/>
+        </w:rPr>
+      </w:pPr>
       <w:r>
         <w:rPr>
           <w:rFonts w:eastAsia="Arial Unicode MS"/>
           <w:bdr w:val="nil"/>
           <w:lang w:val="sv-SE"/>
         </w:rPr>
-        <w:t>Kasza</w:t>
-      </w:r>
-      <w:proofErr w:type="spellEnd"/>
+        <w:t>42.</w:t>
+      </w:r>
       <w:r>
         <w:rPr>
           <w:rFonts w:eastAsia="Arial Unicode MS"/>
           <w:bdr w:val="nil"/>
           <w:lang w:val="sv-SE"/>
         </w:rPr>
-        <w:t xml:space="preserve"> J, </w:t>
-      </w:r>
-      <w:proofErr w:type="spellStart"/>
-      <w:r>
-        <w:rPr>
-          <w:rFonts w:eastAsia="Arial Unicode MS"/>
-          <w:bdr w:val="nil"/>
-          <w:lang w:val="sv-SE"/>
-        </w:rPr>
-        <w:t>Taljaard</w:t>
-      </w:r>
-      <w:proofErr w:type="spellEnd"/>
-      <w:r>
-        <w:rPr>
-          <w:rFonts w:eastAsia="Arial Unicode MS"/>
-          <w:bdr w:val="nil"/>
-          <w:lang w:val="sv-SE"/>
-        </w:rPr>
-        <w:t xml:space="preserve"> M, Hemming K, Haines T, Turner EL, et al. </w:t>
-      </w:r>
-      <w:r>
-        <w:rPr>
-          <w:rFonts w:eastAsia="Arial Unicode MS"/>
-          <w:bdr w:val="nil"/>
-          <w:lang w:val="en-GB"/>
-        </w:rPr>
-        <w:t xml:space="preserve">Intra-cluster correlations from the </w:t>
-      </w:r>
-      <w:proofErr w:type="spellStart"/>
-      <w:r>
-        <w:rPr>
-          <w:rFonts w:eastAsia="Arial Unicode MS"/>
-          <w:bdr w:val="nil"/>
-          <w:lang w:val="en-GB"/>
-        </w:rPr>
-        <w:t>CLustered</w:t>
-      </w:r>
-      <w:proofErr w:type="spellEnd"/>
-      <w:r>
-        <w:rPr>
-          <w:rFonts w:eastAsia="Arial Unicode MS"/>
-          <w:bdr w:val="nil"/>
-          <w:lang w:val="en-GB"/>
-        </w:rPr>
-        <w:t xml:space="preserve"> </w:t>
-      </w:r>
-      <w:proofErr w:type="spellStart"/>
-      <w:r>
-        <w:rPr>
-          <w:rFonts w:eastAsia="Arial Unicode MS"/>
-          <w:bdr w:val="nil"/>
-          <w:lang w:val="en-GB"/>
-        </w:rPr>
-        <w:t>OUtcome</w:t>
-      </w:r>
-      <w:proofErr w:type="spellEnd"/>
-      <w:r>
-        <w:rPr>
-          <w:rFonts w:eastAsia="Arial Unicode MS"/>
-          <w:bdr w:val="nil"/>
-          <w:lang w:val="en-GB"/>
-        </w:rPr>
-        <w:t xml:space="preserve"> Dataset bank to inform the design of longitudinal cluster trials. Clinical Trials. 2021 June;18(5):529–40. </w:t>
-      </w:r>
-    </w:p>
-    <w:p>
-      <w:pPr>
-        <w:pStyle w:val="Bibliography"/>
-        <w:rPr>
-          <w:rFonts w:eastAsia="Arial Unicode MS"/>
-          <w:bdr w:val="nil"/>
-          <w:lang w:val="sv-SE"/>
-        </w:rPr>
-      </w:pPr>
-      <w:r>
-        <w:rPr>
-          <w:rFonts w:eastAsia="Arial Unicode MS"/>
-          <w:bdr w:val="nil"/>
-          <w:lang w:val="en-GB"/>
-        </w:rPr>
-        <w:t>41.</w:t>
-      </w:r>
-      <w:r>
-        <w:rPr>
-          <w:rFonts w:eastAsia="Arial Unicode MS"/>
-          <w:bdr w:val="nil"/>
-          <w:lang w:val="en-GB"/>
-        </w:rPr>
         <w:tab/>
-      </w:r>
-      <w:proofErr w:type="spellStart"/>
-      <w:r>
-        <w:rPr>
-          <w:rFonts w:eastAsia="Arial Unicode MS"/>
-          <w:bdr w:val="nil"/>
-          <w:lang w:val="en-GB"/>
-        </w:rPr>
-        <w:t>Lashoher</w:t>
-      </w:r>
-      <w:proofErr w:type="spellEnd"/>
-      <w:r>
-        <w:rPr>
-          <w:rFonts w:eastAsia="Arial Unicode MS"/>
-          <w:bdr w:val="nil"/>
-          <w:lang w:val="en-GB"/>
-        </w:rPr>
-        <w:t xml:space="preserve"> A, Schneider EB, </w:t>
-      </w:r>
-      <w:proofErr w:type="spellStart"/>
-      <w:r>
-        <w:rPr>
-          <w:rFonts w:eastAsia="Arial Unicode MS"/>
-          <w:bdr w:val="nil"/>
-          <w:lang w:val="en-GB"/>
-        </w:rPr>
-        <w:t>Juillard</w:t>
-      </w:r>
-      <w:proofErr w:type="spellEnd"/>
-      <w:r>
-        <w:rPr>
-          <w:rFonts w:eastAsia="Arial Unicode MS"/>
-          <w:bdr w:val="nil"/>
-          <w:lang w:val="en-GB"/>
-        </w:rPr>
-        <w:t xml:space="preserve"> C, Stevens K, Colantuoni E, Berry WR, et al. Implementation of the World Health Organization Trauma Care Checklist Program in 11 </w:t>
-      </w:r>
-      <w:proofErr w:type="spellStart"/>
-      <w:r>
-        <w:rPr>
-          <w:rFonts w:eastAsia="Arial Unicode MS"/>
-          <w:bdr w:val="nil"/>
-          <w:lang w:val="en-GB"/>
-        </w:rPr>
-        <w:t>Centers</w:t>
-      </w:r>
-      <w:proofErr w:type="spellEnd"/>
-      <w:r>
-        <w:rPr>
-          <w:rFonts w:eastAsia="Arial Unicode MS"/>
-          <w:bdr w:val="nil"/>
-          <w:lang w:val="en-GB"/>
-        </w:rPr>
-        <w:t xml:space="preserve"> Across Multiple Economic Strata: Effect on Care Process Measures. </w:t>
-      </w:r>
-      <w:r>
-        <w:rPr>
-          <w:rFonts w:eastAsia="Arial Unicode MS"/>
-          <w:bdr w:val="nil"/>
-          <w:lang w:val="sv-SE"/>
-        </w:rPr>
-        <w:t xml:space="preserve">World J </w:t>
-      </w:r>
-      <w:proofErr w:type="spellStart"/>
-      <w:r>
-        <w:rPr>
-          <w:rFonts w:eastAsia="Arial Unicode MS"/>
-          <w:bdr w:val="nil"/>
-          <w:lang w:val="sv-SE"/>
-        </w:rPr>
-        <w:t>Surg</w:t>
-      </w:r>
-      <w:proofErr w:type="spellEnd"/>
-      <w:r>
-        <w:rPr>
-          <w:rFonts w:eastAsia="Arial Unicode MS"/>
-          <w:bdr w:val="nil"/>
-          <w:lang w:val="sv-SE"/>
-        </w:rPr>
-        <w:t xml:space="preserve">. 2017 </w:t>
-      </w:r>
-      <w:proofErr w:type="gramStart"/>
-      <w:r>
-        <w:rPr>
-          <w:rFonts w:eastAsia="Arial Unicode MS"/>
-          <w:bdr w:val="nil"/>
-          <w:lang w:val="sv-SE"/>
-        </w:rPr>
-        <w:t>Apr</w:t>
-      </w:r>
-      <w:proofErr w:type="gramEnd"/>
-      <w:r>
-        <w:rPr>
-          <w:rFonts w:eastAsia="Arial Unicode MS"/>
-          <w:bdr w:val="nil"/>
-          <w:lang w:val="sv-SE"/>
-        </w:rPr>
-        <w:t xml:space="preserve">;41(4):954–62. </w:t>
-      </w:r>
-    </w:p>
-    <w:p>
-      <w:pPr>
-        <w:pStyle w:val="Bibliography"/>
-        <w:rPr>
-          <w:rFonts w:eastAsia="Arial Unicode MS"/>
-          <w:bdr w:val="nil"/>
-          <w:lang w:val="en-GB"/>
-        </w:rPr>
-      </w:pPr>
-      <w:r>
-        <w:rPr>
-          <w:rFonts w:eastAsia="Arial Unicode MS"/>
-          <w:bdr w:val="nil"/>
-          <w:lang w:val="sv-SE"/>
-        </w:rPr>
-        <w:t>42.</w:t>
-      </w:r>
-      <w:r>
-        <w:rPr>
-          <w:rFonts w:eastAsia="Arial Unicode MS"/>
-          <w:bdr w:val="nil"/>
-          <w:lang w:val="sv-SE"/>
-        </w:rPr>
-        <w:tab/>
-      </w:r>
-      <w:proofErr w:type="spellStart"/>
-      <w:r>
-        <w:rPr>
-          <w:rFonts w:eastAsia="Arial Unicode MS"/>
-          <w:bdr w:val="nil"/>
-          <w:lang w:val="sv-SE"/>
-        </w:rPr>
-        <w:t>Kapitan</w:t>
-      </w:r>
-      <w:proofErr w:type="spellEnd"/>
-      <w:r>
-        <w:rPr>
-          <w:rFonts w:eastAsia="Arial Unicode MS"/>
-          <w:bdr w:val="nil"/>
-          <w:lang w:val="sv-SE"/>
-        </w:rPr>
-        <w:t xml:space="preserve"> E, Berg J, David S, N ML, </w:t>
-      </w:r>
-      <w:proofErr w:type="spellStart"/>
-      <w:r>
-        <w:rPr>
-          <w:rFonts w:eastAsia="Arial Unicode MS"/>
-          <w:bdr w:val="nil"/>
-          <w:lang w:val="sv-SE"/>
-        </w:rPr>
-        <w:t>Felländer-Tsai</w:t>
-      </w:r>
-      <w:proofErr w:type="spellEnd"/>
-      <w:r>
-        <w:rPr>
-          <w:rFonts w:eastAsia="Arial Unicode MS"/>
-          <w:bdr w:val="nil"/>
-          <w:lang w:val="sv-SE"/>
-        </w:rPr>
-        <w:t xml:space="preserve"> L, </w:t>
-      </w:r>
-      <w:proofErr w:type="spellStart"/>
-      <w:r>
-        <w:rPr>
-          <w:rFonts w:eastAsia="Arial Unicode MS"/>
-          <w:bdr w:val="nil"/>
-          <w:lang w:val="sv-SE"/>
-        </w:rPr>
-        <w:t>Chatterjee</w:t>
-      </w:r>
-      <w:proofErr w:type="spellEnd"/>
-      <w:r>
-        <w:rPr>
-          <w:rFonts w:eastAsia="Arial Unicode MS"/>
-          <w:bdr w:val="nil"/>
-          <w:lang w:val="sv-SE"/>
-        </w:rPr>
-        <w:t xml:space="preserve"> S, et al. </w:t>
+        <w:t xml:space="preserve">Kapitan E, Berg J, David S, N ML, Felländer-Tsai L, Chatterjee S, et al. </w:t>
       </w:r>
       <w:r>
         <w:rPr>
@@ -9853,25 +8605,7 @@
           <w:lang w:val="en-GB"/>
         </w:rPr>
         <w:tab/>
-        <w:t>Harris PA, Taylor R, Thielke R, Payne J, Gonzalez N, Conde JG. Research electronic data capture (</w:t>
-      </w:r>
-      <w:proofErr w:type="spellStart"/>
-      <w:r>
-        <w:rPr>
-          <w:rFonts w:eastAsia="Arial Unicode MS"/>
-          <w:bdr w:val="nil"/>
-          <w:lang w:val="en-GB"/>
-        </w:rPr>
-        <w:t>REDCap</w:t>
-      </w:r>
-      <w:proofErr w:type="spellEnd"/>
-      <w:r>
-        <w:rPr>
-          <w:rFonts w:eastAsia="Arial Unicode MS"/>
-          <w:bdr w:val="nil"/>
-          <w:lang w:val="en-GB"/>
-        </w:rPr>
-        <w:t xml:space="preserve">)--a metadata-driven methodology and workflow process for providing translational research informatics support. </w:t>
+        <w:t xml:space="preserve">Harris PA, Taylor R, Thielke R, Payne J, Gonzalez N, Conde JG. Research electronic data capture (REDCap)--a metadata-driven methodology and workflow process for providing translational research informatics support. </w:t>
       </w:r>
       <w:r>
         <w:rPr>
@@ -9879,61 +8613,7 @@
           <w:bdr w:val="nil"/>
           <w:lang w:val="sv-SE"/>
         </w:rPr>
-        <w:t xml:space="preserve">J </w:t>
-      </w:r>
-      <w:proofErr w:type="spellStart"/>
-      <w:r>
-        <w:rPr>
-          <w:rFonts w:eastAsia="Arial Unicode MS"/>
-          <w:bdr w:val="nil"/>
-          <w:lang w:val="sv-SE"/>
-        </w:rPr>
-        <w:t>Biomed</w:t>
-      </w:r>
-      <w:proofErr w:type="spellEnd"/>
-      <w:r>
-        <w:rPr>
-          <w:rFonts w:eastAsia="Arial Unicode MS"/>
-          <w:bdr w:val="nil"/>
-          <w:lang w:val="sv-SE"/>
-        </w:rPr>
-        <w:t xml:space="preserve"> </w:t>
-      </w:r>
-      <w:proofErr w:type="spellStart"/>
-      <w:r>
-        <w:rPr>
-          <w:rFonts w:eastAsia="Arial Unicode MS"/>
-          <w:bdr w:val="nil"/>
-          <w:lang w:val="sv-SE"/>
-        </w:rPr>
-        <w:t>Inform</w:t>
-      </w:r>
-      <w:proofErr w:type="spellEnd"/>
-      <w:r>
-        <w:rPr>
-          <w:rFonts w:eastAsia="Arial Unicode MS"/>
-          <w:bdr w:val="nil"/>
-          <w:lang w:val="sv-SE"/>
-        </w:rPr>
-        <w:t xml:space="preserve">. 2009 </w:t>
-      </w:r>
-      <w:proofErr w:type="gramStart"/>
-      <w:r>
-        <w:rPr>
-          <w:rFonts w:eastAsia="Arial Unicode MS"/>
-          <w:bdr w:val="nil"/>
-          <w:lang w:val="sv-SE"/>
-        </w:rPr>
-        <w:t>Apr</w:t>
-      </w:r>
-      <w:proofErr w:type="gramEnd"/>
-      <w:r>
-        <w:rPr>
-          <w:rFonts w:eastAsia="Arial Unicode MS"/>
-          <w:bdr w:val="nil"/>
-          <w:lang w:val="sv-SE"/>
-        </w:rPr>
-        <w:t xml:space="preserve">;42(2):377–81. </w:t>
+        <w:t xml:space="preserve">J Biomed Inform. 2009 Apr;42(2):377–81. </w:t>
       </w:r>
     </w:p>
     <w:p>
@@ -9968,43 +8648,7 @@
           <w:bdr w:val="nil"/>
           <w:lang w:val="en-GB"/>
         </w:rPr>
-        <w:t xml:space="preserve">The </w:t>
-      </w:r>
-      <w:proofErr w:type="spellStart"/>
-      <w:r>
-        <w:rPr>
-          <w:rFonts w:eastAsia="Arial Unicode MS"/>
-          <w:bdr w:val="nil"/>
-          <w:lang w:val="en-GB"/>
-        </w:rPr>
-        <w:t>REDCap</w:t>
-      </w:r>
-      <w:proofErr w:type="spellEnd"/>
-      <w:r>
-        <w:rPr>
-          <w:rFonts w:eastAsia="Arial Unicode MS"/>
-          <w:bdr w:val="nil"/>
-          <w:lang w:val="en-GB"/>
-        </w:rPr>
-        <w:t xml:space="preserve"> consortium: Building an international community of software platform partners. J Biomed Inform. 2019 </w:t>
-      </w:r>
-      <w:proofErr w:type="gramStart"/>
-      <w:r>
-        <w:rPr>
-          <w:rFonts w:eastAsia="Arial Unicode MS"/>
-          <w:bdr w:val="nil"/>
-          <w:lang w:val="en-GB"/>
-        </w:rPr>
-        <w:t>July;95:103208</w:t>
-      </w:r>
-      <w:proofErr w:type="gramEnd"/>
-      <w:r>
-        <w:rPr>
-          <w:rFonts w:eastAsia="Arial Unicode MS"/>
-          <w:bdr w:val="nil"/>
-          <w:lang w:val="en-GB"/>
-        </w:rPr>
-        <w:t xml:space="preserve">. </w:t>
+        <w:t xml:space="preserve">The REDCap consortium: Building an international community of software platform partners. J Biomed Inform. 2019 July;95:103208. </w:t>
       </w:r>
     </w:p>
     <w:p>
@@ -10058,24 +8702,7 @@
           <w:lang w:val="en-GB"/>
         </w:rPr>
         <w:tab/>
-      </w:r>
-      <w:proofErr w:type="spellStart"/>
-      <w:r>
-        <w:rPr>
-          <w:rFonts w:eastAsia="Arial Unicode MS"/>
-          <w:bdr w:val="nil"/>
-          <w:lang w:val="en-GB"/>
-        </w:rPr>
-        <w:t>Voldal</w:t>
-      </w:r>
-      <w:proofErr w:type="spellEnd"/>
-      <w:r>
-        <w:rPr>
-          <w:rFonts w:eastAsia="Arial Unicode MS"/>
-          <w:bdr w:val="nil"/>
-          <w:lang w:val="en-GB"/>
-        </w:rPr>
-        <w:t xml:space="preserve"> EC, Xia F, Kenny A, Heagerty PJ, Hughes JP. Model misspecification in stepped wedge trials: Random effects for time or treatment. Stat Med. 2022 May 10;41(10):1751–66. </w:t>
+        <w:t xml:space="preserve">Voldal EC, Xia F, Kenny A, Heagerty PJ, Hughes JP. Model misspecification in stepped wedge trials: Random effects for time or treatment. Stat Med. 2022 May 10;41(10):1751–66. </w:t>
       </w:r>
     </w:p>
     <w:p>
@@ -10102,25 +8729,7 @@
           <w:lang w:val="en-GB"/>
         </w:rPr>
         <w:tab/>
-        <w:t xml:space="preserve">Grantham KL, Kasza J, Heritier S, Carlin JB, Forbes AB. Evaluating the performance of Bayesian and restricted maximum likelihood estimation for stepped wedge cluster randomized trials with a small number of clusters. BMC Med Res </w:t>
-      </w:r>
-      <w:proofErr w:type="spellStart"/>
-      <w:r>
-        <w:rPr>
-          <w:rFonts w:eastAsia="Arial Unicode MS"/>
-          <w:bdr w:val="nil"/>
-          <w:lang w:val="en-GB"/>
-        </w:rPr>
-        <w:t>Methodol</w:t>
-      </w:r>
-      <w:proofErr w:type="spellEnd"/>
-      <w:r>
-        <w:rPr>
-          <w:rFonts w:eastAsia="Arial Unicode MS"/>
-          <w:bdr w:val="nil"/>
-          <w:lang w:val="en-GB"/>
-        </w:rPr>
-        <w:t xml:space="preserve">. 2022 Apr 13;22(1):112. </w:t>
+        <w:t xml:space="preserve">Grantham KL, Kasza J, Heritier S, Carlin JB, Forbes AB. Evaluating the performance of Bayesian and restricted maximum likelihood estimation for stepped wedge cluster randomized trials with a small number of clusters. BMC Med Res Methodol. 2022 Apr 13;22(1):112. </w:t>
       </w:r>
     </w:p>
     <w:p>
@@ -10147,43 +8756,7 @@
           <w:lang w:val="en-GB"/>
         </w:rPr>
         <w:tab/>
-        <w:t xml:space="preserve">Diaz T, Strong KL, Cao B, </w:t>
-      </w:r>
-      <w:proofErr w:type="spellStart"/>
-      <w:r>
-        <w:rPr>
-          <w:rFonts w:eastAsia="Arial Unicode MS"/>
-          <w:bdr w:val="nil"/>
-          <w:lang w:val="en-GB"/>
-        </w:rPr>
-        <w:t>Guthold</w:t>
-      </w:r>
-      <w:proofErr w:type="spellEnd"/>
-      <w:r>
-        <w:rPr>
-          <w:rFonts w:eastAsia="Arial Unicode MS"/>
-          <w:bdr w:val="nil"/>
-          <w:lang w:val="en-GB"/>
-        </w:rPr>
-        <w:t xml:space="preserve"> R, Moran AC, Moller AB, et al. A call for standardised age-disaggregated health data. The Lancet Healthy Longevity. 2021 July 1;2(7</w:t>
-      </w:r>
-      <w:proofErr w:type="gramStart"/>
-      <w:r>
-        <w:rPr>
-          <w:rFonts w:eastAsia="Arial Unicode MS"/>
-          <w:bdr w:val="nil"/>
-          <w:lang w:val="en-GB"/>
-        </w:rPr>
-        <w:t>):e</w:t>
-      </w:r>
-      <w:proofErr w:type="gramEnd"/>
-      <w:r>
-        <w:rPr>
-          <w:rFonts w:eastAsia="Arial Unicode MS"/>
-          <w:bdr w:val="nil"/>
-          <w:lang w:val="en-GB"/>
-        </w:rPr>
-        <w:t xml:space="preserve">436–43. </w:t>
+        <w:t xml:space="preserve">Diaz T, Strong KL, Cao B, Guthold R, Moran AC, Moller AB, et al. A call for standardised age-disaggregated health data. The Lancet Healthy Longevity. 2021 July 1;2(7):e436–43. </w:t>
       </w:r>
     </w:p>
     <w:p>
@@ -10210,25 +8783,7 @@
           <w:lang w:val="en-GB"/>
         </w:rPr>
         <w:tab/>
-        <w:t xml:space="preserve">Hornor MA, Hoeft C, </w:t>
-      </w:r>
-      <w:proofErr w:type="spellStart"/>
-      <w:r>
-        <w:rPr>
-          <w:rFonts w:eastAsia="Arial Unicode MS"/>
-          <w:bdr w:val="nil"/>
-          <w:lang w:val="en-GB"/>
-        </w:rPr>
-        <w:t>Nathens</w:t>
-      </w:r>
-      <w:proofErr w:type="spellEnd"/>
-      <w:r>
-        <w:rPr>
-          <w:rFonts w:eastAsia="Arial Unicode MS"/>
-          <w:bdr w:val="nil"/>
-          <w:lang w:val="en-GB"/>
-        </w:rPr>
-        <w:t xml:space="preserve"> AB. Quality Benchmarking in Trauma: from the NTDB to TQIP. Current Trauma Reports. 2018 Apr;4(2):160–9. </w:t>
+        <w:t xml:space="preserve">Hornor MA, Hoeft C, Nathens AB. Quality Benchmarking in Trauma: from the NTDB to TQIP. Current Trauma Reports. 2018 Apr;4(2):160–9. </w:t>
       </w:r>
     </w:p>
     <w:p>
@@ -10255,43 +8810,7 @@
           <w:lang w:val="en-GB"/>
         </w:rPr>
         <w:tab/>
-        <w:t xml:space="preserve">Kamp CB, Dankiewicz J, Harboe Olsen M, Holgersson J, Saxena M, Young P, et al. Sedation, temperature and pressure after cardiac arrest and resuscitation—The STEPCARE trial: A statistical analysis plan. Acta </w:t>
-      </w:r>
-      <w:proofErr w:type="spellStart"/>
-      <w:r>
-        <w:rPr>
-          <w:rFonts w:eastAsia="Arial Unicode MS"/>
-          <w:bdr w:val="nil"/>
-          <w:lang w:val="en-GB"/>
-        </w:rPr>
-        <w:t>Anaesthesiologica</w:t>
-      </w:r>
-      <w:proofErr w:type="spellEnd"/>
-      <w:r>
-        <w:rPr>
-          <w:rFonts w:eastAsia="Arial Unicode MS"/>
-          <w:bdr w:val="nil"/>
-          <w:lang w:val="en-GB"/>
-        </w:rPr>
-        <w:t xml:space="preserve"> Scandinavica. 2025;69(5</w:t>
-      </w:r>
-      <w:proofErr w:type="gramStart"/>
-      <w:r>
-        <w:rPr>
-          <w:rFonts w:eastAsia="Arial Unicode MS"/>
-          <w:bdr w:val="nil"/>
-          <w:lang w:val="en-GB"/>
-        </w:rPr>
-        <w:t>):e</w:t>
-      </w:r>
-      <w:proofErr w:type="gramEnd"/>
-      <w:r>
-        <w:rPr>
-          <w:rFonts w:eastAsia="Arial Unicode MS"/>
-          <w:bdr w:val="nil"/>
-          <w:lang w:val="en-GB"/>
-        </w:rPr>
-        <w:t xml:space="preserve">70033. </w:t>
+        <w:t xml:space="preserve">Kamp CB, Dankiewicz J, Harboe Olsen M, Holgersson J, Saxena M, Young P, et al. Sedation, temperature and pressure after cardiac arrest and resuscitation—The STEPCARE trial: A statistical analysis plan. Acta Anaesthesiologica Scandinavica. 2025;69(5):e70033. </w:t>
       </w:r>
     </w:p>
     <w:p>
@@ -10330,53 +8849,13 @@
       </w:r>
     </w:p>
     <w:sectPr>
-      <w:footerReference w:type="default" r:id="rId15"/>
+      <w:footerReference w:type="default" r:id="rId11"/>
       <w:pgSz w:w="11900" w:h="16840"/>
       <w:pgMar w:top="1440" w:right="1134" w:bottom="1440" w:left="1134" w:header="709" w:footer="709" w:gutter="0"/>
       <w:cols w:space="720"/>
     </w:sectPr>
   </w:body>
 </w:document>
-</file>
-
-<file path=word/comments.xml><?xml version="1.0" encoding="utf-8"?>
-<w:comments xmlns:wpc="http://schemas.microsoft.com/office/word/2010/wordprocessingCanvas" xmlns:cx="http://schemas.microsoft.com/office/drawing/2014/chartex" xmlns:cx1="http://schemas.microsoft.com/office/drawing/2015/9/8/chartex" xmlns:cx2="http://schemas.microsoft.com/office/drawing/2015/10/21/chartex" xmlns:cx3="http://schemas.microsoft.com/office/drawing/2016/5/9/chartex" xmlns:cx4="http://schemas.microsoft.com/office/drawing/2016/5/10/chartex" xmlns:cx5="http://schemas.microsoft.com/office/drawing/2016/5/11/chartex" xmlns:cx6="http://schemas.microsoft.com/office/drawing/2016/5/12/chartex" xmlns:cx7="http://schemas.microsoft.com/office/drawing/2016/5/13/chartex" xmlns:cx8="http://schemas.microsoft.com/office/drawing/2016/5/14/chartex" xmlns:mc="http://schemas.openxmlformats.org/markup-compatibility/2006" xmlns:aink="http://schemas.microsoft.com/office/drawing/2016/ink" xmlns:am3d="http://schemas.microsoft.com/office/drawing/2017/model3d" xmlns:o="urn:schemas-microsoft-com:office:office" xmlns:oel="http://schemas.microsoft.com/office/2019/extlst" xmlns:r="http://schemas.openxmlformats.org/officeDocument/2006/relationships" xmlns:m="http://schemas.openxmlformats.org/officeDocument/2006/math" xmlns:v="urn:schemas-microsoft-com:vml" xmlns:wp14="http://schemas.microsoft.com/office/word/2010/wordprocessingDrawing" xmlns:wp="http://schemas.openxmlformats.org/drawingml/2006/wordprocessingDrawing" xmlns:w10="urn:schemas-microsoft-com:office:word" xmlns:w="http://schemas.openxmlformats.org/wordprocessingml/2006/main" xmlns:w14="http://schemas.microsoft.com/office/word/2010/wordml" xmlns:w15="http://schemas.microsoft.com/office/word/2012/wordml" xmlns:w16cex="http://schemas.microsoft.com/office/word/2018/wordml/cex" xmlns:w16cid="http://schemas.microsoft.com/office/word/2016/wordml/cid" xmlns:w16="http://schemas.microsoft.com/office/word/2018/wordml" xmlns:w16du="http://schemas.microsoft.com/office/word/2023/wordml/word16du" xmlns:w16sdtdh="http://schemas.microsoft.com/office/word/2020/wordml/sdtdatahash" xmlns:w16sdtfl="http://schemas.microsoft.com/office/word/2024/wordml/sdtformatlock" xmlns:w16se="http://schemas.microsoft.com/office/word/2015/wordml/symex" xmlns:wpg="http://schemas.microsoft.com/office/word/2010/wordprocessingGroup" xmlns:wpi="http://schemas.microsoft.com/office/word/2010/wordprocessingInk" xmlns:wne="http://schemas.microsoft.com/office/word/2006/wordml" xmlns:wps="http://schemas.microsoft.com/office/word/2010/wordprocessingShape" mc:Ignorable="w14 w15 w16se w16cid w16 w16cex w16sdtdh w16sdtfl w16du wp14">
-  <w:comment w:id="0" w:author="Martin Gerdin Wärnberg" w:date="2025-11-22T06:18:00Z" w:initials="MG">
-    <w:p>
-      <w:r>
-        <w:rPr>
-          <w:rStyle w:val="CommentReference"/>
-        </w:rPr>
-        <w:annotationRef/>
-      </w:r>
-      <w:r>
-        <w:rPr>
-          <w:sz w:val="20"/>
-          <w:szCs w:val="20"/>
-        </w:rPr>
-        <w:t>@prashant, please add the date of CTRI registration</w:t>
-      </w:r>
-    </w:p>
-  </w:comment>
-</w:comments>
-</file>
-
-<file path=word/commentsExtended.xml><?xml version="1.0" encoding="utf-8"?>
-<w15:commentsEx xmlns:wpc="http://schemas.microsoft.com/office/word/2010/wordprocessingCanvas" xmlns:cx="http://schemas.microsoft.com/office/drawing/2014/chartex" xmlns:cx1="http://schemas.microsoft.com/office/drawing/2015/9/8/chartex" xmlns:cx2="http://schemas.microsoft.com/office/drawing/2015/10/21/chartex" xmlns:cx3="http://schemas.microsoft.com/office/drawing/2016/5/9/chartex" xmlns:cx4="http://schemas.microsoft.com/office/drawing/2016/5/10/chartex" xmlns:cx5="http://schemas.microsoft.com/office/drawing/2016/5/11/chartex" xmlns:cx6="http://schemas.microsoft.com/office/drawing/2016/5/12/chartex" xmlns:cx7="http://schemas.microsoft.com/office/drawing/2016/5/13/chartex" xmlns:cx8="http://schemas.microsoft.com/office/drawing/2016/5/14/chartex" xmlns:mc="http://schemas.openxmlformats.org/markup-compatibility/2006" xmlns:aink="http://schemas.microsoft.com/office/drawing/2016/ink" xmlns:am3d="http://schemas.microsoft.com/office/drawing/2017/model3d" xmlns:o="urn:schemas-microsoft-com:office:office" xmlns:oel="http://schemas.microsoft.com/office/2019/extlst" xmlns:r="http://schemas.openxmlformats.org/officeDocument/2006/relationships" xmlns:m="http://schemas.openxmlformats.org/officeDocument/2006/math" xmlns:v="urn:schemas-microsoft-com:vml" xmlns:wp14="http://schemas.microsoft.com/office/word/2010/wordprocessingDrawing" xmlns:wp="http://schemas.openxmlformats.org/drawingml/2006/wordprocessingDrawing" xmlns:w10="urn:schemas-microsoft-com:office:word" xmlns:w="http://schemas.openxmlformats.org/wordprocessingml/2006/main" xmlns:w14="http://schemas.microsoft.com/office/word/2010/wordml" xmlns:w15="http://schemas.microsoft.com/office/word/2012/wordml" xmlns:w16cex="http://schemas.microsoft.com/office/word/2018/wordml/cex" xmlns:w16cid="http://schemas.microsoft.com/office/word/2016/wordml/cid" xmlns:w16="http://schemas.microsoft.com/office/word/2018/wordml" xmlns:w16du="http://schemas.microsoft.com/office/word/2023/wordml/word16du" xmlns:w16sdtdh="http://schemas.microsoft.com/office/word/2020/wordml/sdtdatahash" xmlns:w16sdtfl="http://schemas.microsoft.com/office/word/2024/wordml/sdtformatlock" xmlns:w16se="http://schemas.microsoft.com/office/word/2015/wordml/symex" xmlns:wpg="http://schemas.microsoft.com/office/word/2010/wordprocessingGroup" xmlns:wpi="http://schemas.microsoft.com/office/word/2010/wordprocessingInk" xmlns:wne="http://schemas.microsoft.com/office/word/2006/wordml" xmlns:wps="http://schemas.microsoft.com/office/word/2010/wordprocessingShape" mc:Ignorable="w14 w15 w16se w16cid w16 w16cex w16sdtdh w16sdtfl w16du wp14">
-  <w15:commentEx w15:paraId="12283C57" w15:done="0"/>
-</w15:commentsEx>
-</file>
-
-<file path=word/commentsExtensible.xml><?xml version="1.0" encoding="utf-8"?>
-<w16cex:commentsExtensible xmlns:wpc="http://schemas.microsoft.com/office/word/2010/wordprocessingCanvas" xmlns:cx="http://schemas.microsoft.com/office/drawing/2014/chartex" xmlns:cx1="http://schemas.microsoft.com/office/drawing/2015/9/8/chartex" xmlns:cx2="http://schemas.microsoft.com/office/drawing/2015/10/21/chartex" xmlns:cx3="http://schemas.microsoft.com/office/drawing/2016/5/9/chartex" xmlns:cx4="http://schemas.microsoft.com/office/drawing/2016/5/10/chartex" xmlns:cx5="http://schemas.microsoft.com/office/drawing/2016/5/11/chartex" xmlns:cx6="http://schemas.microsoft.com/office/drawing/2016/5/12/chartex" xmlns:cx7="http://schemas.microsoft.com/office/drawing/2016/5/13/chartex" xmlns:cx8="http://schemas.microsoft.com/office/drawing/2016/5/14/chartex" xmlns:cr="http://schemas.microsoft.com/office/comments/2020/reactions" xmlns:mc="http://schemas.openxmlformats.org/markup-compatibility/2006" xmlns:aink="http://schemas.microsoft.com/office/drawing/2016/ink" xmlns:am3d="http://schemas.microsoft.com/office/drawing/2017/model3d" xmlns:o="urn:schemas-microsoft-com:office:office" xmlns:oel="http://schemas.microsoft.com/office/2019/extlst" xmlns:r="http://schemas.openxmlformats.org/officeDocument/2006/relationships" xmlns:m="http://schemas.openxmlformats.org/officeDocument/2006/math" xmlns:v="urn:schemas-microsoft-com:vml" xmlns:wp14="http://schemas.microsoft.com/office/word/2010/wordprocessingDrawing" xmlns:wp="http://schemas.openxmlformats.org/drawingml/2006/wordprocessingDrawing" xmlns:w10="urn:schemas-microsoft-com:office:word" xmlns:w="http://schemas.openxmlformats.org/wordprocessingml/2006/main" xmlns:w14="http://schemas.microsoft.com/office/word/2010/wordml" xmlns:w15="http://schemas.microsoft.com/office/word/2012/wordml" xmlns:w16cex="http://schemas.microsoft.com/office/word/2018/wordml/cex" xmlns:w16cid="http://schemas.microsoft.com/office/word/2016/wordml/cid" xmlns:w16="http://schemas.microsoft.com/office/word/2018/wordml" xmlns:w16du="http://schemas.microsoft.com/office/word/2023/wordml/word16du" xmlns:w16sdtdh="http://schemas.microsoft.com/office/word/2020/wordml/sdtdatahash" xmlns:w16sdtfl="http://schemas.microsoft.com/office/word/2024/wordml/sdtformatlock" xmlns:w16se="http://schemas.microsoft.com/office/word/2015/wordml/symex" xmlns:wpg="http://schemas.microsoft.com/office/word/2010/wordprocessingGroup" xmlns:wpi="http://schemas.microsoft.com/office/word/2010/wordprocessingInk" xmlns:wne="http://schemas.microsoft.com/office/word/2006/wordml" xmlns:wps="http://schemas.microsoft.com/office/word/2010/wordprocessingShape" mc:Ignorable="w14 w15 w16se w16cid w16 w16cex w16sdtdh w16sdtfl cr w16du wp14">
-  <w16cex:commentExtensible w16cex:durableId="676F929B" w16cex:dateUtc="2025-11-22T05:18:00Z"/>
-</w16cex:commentsExtensible>
-</file>
-
-<file path=word/commentsIds.xml><?xml version="1.0" encoding="utf-8"?>
-<w16cid:commentsIds xmlns:wpc="http://schemas.microsoft.com/office/word/2010/wordprocessingCanvas" xmlns:cx="http://schemas.microsoft.com/office/drawing/2014/chartex" xmlns:cx1="http://schemas.microsoft.com/office/drawing/2015/9/8/chartex" xmlns:cx2="http://schemas.microsoft.com/office/drawing/2015/10/21/chartex" xmlns:cx3="http://schemas.microsoft.com/office/drawing/2016/5/9/chartex" xmlns:cx4="http://schemas.microsoft.com/office/drawing/2016/5/10/chartex" xmlns:cx5="http://schemas.microsoft.com/office/drawing/2016/5/11/chartex" xmlns:cx6="http://schemas.microsoft.com/office/drawing/2016/5/12/chartex" xmlns:cx7="http://schemas.microsoft.com/office/drawing/2016/5/13/chartex" xmlns:cx8="http://schemas.microsoft.com/office/drawing/2016/5/14/chartex" xmlns:mc="http://schemas.openxmlformats.org/markup-compatibility/2006" xmlns:aink="http://schemas.microsoft.com/office/drawing/2016/ink" xmlns:am3d="http://schemas.microsoft.com/office/drawing/2017/model3d" xmlns:o="urn:schemas-microsoft-com:office:office" xmlns:oel="http://schemas.microsoft.com/office/2019/extlst" xmlns:r="http://schemas.openxmlformats.org/officeDocument/2006/relationships" xmlns:m="http://schemas.openxmlformats.org/officeDocument/2006/math" xmlns:v="urn:schemas-microsoft-com:vml" xmlns:wp14="http://schemas.microsoft.com/office/word/2010/wordprocessingDrawing" xmlns:wp="http://schemas.openxmlformats.org/drawingml/2006/wordprocessingDrawing" xmlns:w10="urn:schemas-microsoft-com:office:word" xmlns:w="http://schemas.openxmlformats.org/wordprocessingml/2006/main" xmlns:w14="http://schemas.microsoft.com/office/word/2010/wordml" xmlns:w15="http://schemas.microsoft.com/office/word/2012/wordml" xmlns:w16cex="http://schemas.microsoft.com/office/word/2018/wordml/cex" xmlns:w16cid="http://schemas.microsoft.com/office/word/2016/wordml/cid" xmlns:w16="http://schemas.microsoft.com/office/word/2018/wordml" xmlns:w16du="http://schemas.microsoft.com/office/word/2023/wordml/word16du" xmlns:w16sdtdh="http://schemas.microsoft.com/office/word/2020/wordml/sdtdatahash" xmlns:w16sdtfl="http://schemas.microsoft.com/office/word/2024/wordml/sdtformatlock" xmlns:w16se="http://schemas.microsoft.com/office/word/2015/wordml/symex" xmlns:wpg="http://schemas.microsoft.com/office/word/2010/wordprocessingGroup" xmlns:wpi="http://schemas.microsoft.com/office/word/2010/wordprocessingInk" xmlns:wne="http://schemas.microsoft.com/office/word/2006/wordml" xmlns:wps="http://schemas.microsoft.com/office/word/2010/wordprocessingShape" mc:Ignorable="w14 w15 w16se w16cid w16 w16cex w16sdtdh w16sdtfl w16du wp14">
-  <w16cid:commentId w16cid:paraId="12283C57" w16cid:durableId="676F929B"/>
-</w16cid:commentsIds>
 </file>
 
 <file path=word/endnotes.xml><?xml version="1.0" encoding="utf-8"?>
@@ -12512,14 +10991,6 @@
     <w:abstractNumId w:val="15"/>
   </w:num>
 </w:numbering>
-</file>
-
-<file path=word/people.xml><?xml version="1.0" encoding="utf-8"?>
-<w15:people xmlns:wpc="http://schemas.microsoft.com/office/word/2010/wordprocessingCanvas" xmlns:cx="http://schemas.microsoft.com/office/drawing/2014/chartex" xmlns:cx1="http://schemas.microsoft.com/office/drawing/2015/9/8/chartex" xmlns:cx2="http://schemas.microsoft.com/office/drawing/2015/10/21/chartex" xmlns:cx3="http://schemas.microsoft.com/office/drawing/2016/5/9/chartex" xmlns:cx4="http://schemas.microsoft.com/office/drawing/2016/5/10/chartex" xmlns:cx5="http://schemas.microsoft.com/office/drawing/2016/5/11/chartex" xmlns:cx6="http://schemas.microsoft.com/office/drawing/2016/5/12/chartex" xmlns:cx7="http://schemas.microsoft.com/office/drawing/2016/5/13/chartex" xmlns:cx8="http://schemas.microsoft.com/office/drawing/2016/5/14/chartex" xmlns:mc="http://schemas.openxmlformats.org/markup-compatibility/2006" xmlns:aink="http://schemas.microsoft.com/office/drawing/2016/ink" xmlns:am3d="http://schemas.microsoft.com/office/drawing/2017/model3d" xmlns:o="urn:schemas-microsoft-com:office:office" xmlns:oel="http://schemas.microsoft.com/office/2019/extlst" xmlns:r="http://schemas.openxmlformats.org/officeDocument/2006/relationships" xmlns:m="http://schemas.openxmlformats.org/officeDocument/2006/math" xmlns:v="urn:schemas-microsoft-com:vml" xmlns:wp14="http://schemas.microsoft.com/office/word/2010/wordprocessingDrawing" xmlns:wp="http://schemas.openxmlformats.org/drawingml/2006/wordprocessingDrawing" xmlns:w10="urn:schemas-microsoft-com:office:word" xmlns:w="http://schemas.openxmlformats.org/wordprocessingml/2006/main" xmlns:w14="http://schemas.microsoft.com/office/word/2010/wordml" xmlns:w15="http://schemas.microsoft.com/office/word/2012/wordml" xmlns:w16cex="http://schemas.microsoft.com/office/word/2018/wordml/cex" xmlns:w16cid="http://schemas.microsoft.com/office/word/2016/wordml/cid" xmlns:w16="http://schemas.microsoft.com/office/word/2018/wordml" xmlns:w16du="http://schemas.microsoft.com/office/word/2023/wordml/word16du" xmlns:w16sdtdh="http://schemas.microsoft.com/office/word/2020/wordml/sdtdatahash" xmlns:w16sdtfl="http://schemas.microsoft.com/office/word/2024/wordml/sdtformatlock" xmlns:w16se="http://schemas.microsoft.com/office/word/2015/wordml/symex" xmlns:wpg="http://schemas.microsoft.com/office/word/2010/wordprocessingGroup" xmlns:wpi="http://schemas.microsoft.com/office/word/2010/wordprocessingInk" xmlns:wne="http://schemas.microsoft.com/office/word/2006/wordml" xmlns:wps="http://schemas.microsoft.com/office/word/2010/wordprocessingShape" mc:Ignorable="w14 w15 w16se w16cid w16 w16cex w16sdtdh w16sdtfl w16du wp14">
-  <w15:person w15:author="Martin Gerdin Wärnberg">
-    <w15:presenceInfo w15:providerId="AD" w15:userId="S::martin.gerdin@ki.se::77153f61-4c5f-462a-acd4-483a5c64ba16"/>
-  </w15:person>
-</w15:people>
 </file>
 
 <file path=word/styles.xml><?xml version="1.0" encoding="utf-8"?>
@@ -13185,6 +11656,7 @@
   <w:style w:type="character" w:default="1" w:styleId="DefaultParagraphFont">
     <w:name w:val="Default Paragraph Font"/>
     <w:uiPriority w:val="1"/>
+    <w:semiHidden/>
     <w:unhideWhenUsed/>
   </w:style>
   <w:style w:type="table" w:default="1" w:styleId="TableNormal">

</xml_diff>